<commit_message>
pipeline(2B): build_form_maps --one + docx_to_blocks --one cho 7 mau thay doi - M12: 3 bang nganh_bo_sung/nganh_xoa_bo/nganh_sua_doi_chi_tiet; M17/M19/M21/M23/M25/M72: ds_nganh; vung drop sach khong con tieu de roi, form_maps de dirty local
</commit_message>
<xml_diff>
--- a/app/templates/PLI_M12.docx
+++ b/app/templates/PLI_M12.docx
@@ -2837,75 +2837,299 @@
         <w:t xml:space="preserve">):</w:t>
       </w:r>
     </w:p>
-    <w:p>
-      <w:pPr>
-        <w:jc w:val="center"/>
-        <w:spacing w:before="120"/>
-      </w:pPr>
-      <w:r>
-        <w:rPr>
-          <w:rFonts w:ascii="Arial" w:hAnsi="Arial" w:cs="Arial"/>
-          <w:sz w:val="24"/>
-          <w:sz-cs w:val="24"/>
-        </w:rPr>
-        <w:t xml:space="preserve">STT</w:t>
-      </w:r>
-    </w:p>
-    <w:p>
-      <w:pPr>
-        <w:jc w:val="center"/>
-        <w:spacing w:before="120"/>
-      </w:pPr>
-      <w:r>
-        <w:rPr>
-          <w:rFonts w:ascii="Arial" w:hAnsi="Arial" w:cs="Arial"/>
-          <w:sz w:val="24"/>
-          <w:sz-cs w:val="24"/>
-        </w:rPr>
-        <w:t xml:space="preserve">Tên ngành, nghề kinh doanh được bổ sung</w:t>
-      </w:r>
-    </w:p>
-    <w:p>
-      <w:pPr>
-        <w:jc w:val="center"/>
-        <w:spacing w:before="120"/>
-      </w:pPr>
-      <w:r>
-        <w:rPr>
-          <w:rFonts w:ascii="Arial" w:hAnsi="Arial" w:cs="Arial"/>
-          <w:sz w:val="24"/>
-          <w:sz-cs w:val="24"/>
-        </w:rPr>
-        <w:t xml:space="preserve">Mã ngành</w:t>
-      </w:r>
-    </w:p>
-    <w:p>
-      <w:pPr>
-        <w:jc w:val="center"/>
-        <w:spacing w:before="120"/>
-      </w:pPr>
-      <w:r>
-        <w:rPr>
-          <w:rFonts w:ascii="Arial" w:hAnsi="Arial" w:cs="Arial"/>
-          <w:sz w:val="24"/>
-          <w:sz-cs w:val="24"/>
-        </w:rPr>
-        <w:t xml:space="preserve">Ngành, nghề kinh doanh chính (</w:t>
-      </w:r>
-      <w:r>
-        <w:rPr>
-          <w:rFonts w:ascii="Arial" w:hAnsi="Arial" w:cs="Arial"/>
-          <w:sz w:val="24"/>
-          <w:sz-cs w:val="24"/>
-          <w:i/>
-        </w:rPr>
-        <w:t xml:space="preserve">Trường hợp ngành, nghề kinh doanh được bổ sung là ngành, nghề kinh doanh chính thì</w:t>
-      </w:r>
-      <w:r>
-        <w:rPr>
-          <w:rFonts w:ascii="Arial" w:hAnsi="Arial" w:cs="Arial"/>
-          <w:sz w:val="24"/>
-          <w:sz-cs w:val="24"/>
+    <w:tbl>
+      <w:tblPr>
+        <w:tblW w:type="auto" w:w="0"/>
+        <w:tblLook w:firstColumn="1" w:firstRow="1" w:lastColumn="0" w:lastRow="0" w:noHBand="0" w:noVBand="1" w:val="04A0"/>
+        <w:tblBorders>
+          <w:top w:val="single" w:sz="4" w:color="000000"/>
+          <w:left w:val="single" w:sz="4" w:color="000000"/>
+          <w:bottom w:val="single" w:sz="4" w:color="000000"/>
+          <w:right w:val="single" w:sz="4" w:color="000000"/>
+          <w:insideH w:val="single" w:sz="4" w:color="000000"/>
+          <w:insideV w:val="single" w:sz="4" w:color="000000"/>
+        </w:tblBorders>
+      </w:tblPr>
+      <w:tblGrid>
+        <w:gridCol w:w="2160"/>
+        <w:gridCol w:w="2160"/>
+        <w:gridCol w:w="2160"/>
+        <w:gridCol w:w="2160"/>
+      </w:tblGrid>
+      <w:tr>
+        <w:tc>
+          <w:tcPr>
+            <w:tcW w:type="dxa" w:w="2160"/>
+          </w:tcPr>
+          <w:p>
+            <w:r>
+              <w:rPr>
+                <w:b/>
+              </w:rPr>
+              <w:t>STT</w:t>
+            </w:r>
+          </w:p>
+        </w:tc>
+        <w:tc>
+          <w:tcPr>
+            <w:tcW w:type="dxa" w:w="2160"/>
+          </w:tcPr>
+          <w:p>
+            <w:r>
+              <w:rPr>
+                <w:b/>
+              </w:rPr>
+              <w:t>Tên ngành, nghề kinh doanh được bổ sung</w:t>
+            </w:r>
+          </w:p>
+        </w:tc>
+        <w:tc>
+          <w:tcPr>
+            <w:tcW w:type="dxa" w:w="2160"/>
+          </w:tcPr>
+          <w:p>
+            <w:r>
+              <w:rPr>
+                <w:b/>
+              </w:rPr>
+              <w:t>Mã ngành</w:t>
+            </w:r>
+          </w:p>
+        </w:tc>
+        <w:tc>
+          <w:tcPr>
+            <w:tcW w:type="dxa" w:w="2160"/>
+          </w:tcPr>
+          <w:p>
+            <w:r>
+              <w:rPr>
+                <w:b/>
+              </w:rPr>
+              <w:t>Ngành, nghề kinh doanh chính</w:t>
+            </w:r>
+          </w:p>
+        </w:tc>
+      </w:tr>
+      <w:tr>
+        <w:tc>
+          <w:tcPr>
+            <w:tcW w:type="dxa" w:w="2160"/>
+          </w:tcPr>
+          <w:p/>
+        </w:tc>
+        <w:tc>
+          <w:tcPr>
+            <w:tcW w:type="dxa" w:w="2160"/>
+          </w:tcPr>
+          <w:p/>
+        </w:tc>
+        <w:tc>
+          <w:tcPr>
+            <w:tcW w:type="dxa" w:w="2160"/>
+          </w:tcPr>
+          <w:p/>
+        </w:tc>
+        <w:tc>
+          <w:tcPr>
+            <w:tcW w:type="dxa" w:w="2160"/>
+          </w:tcPr>
+          <w:p/>
+        </w:tc>
+      </w:tr>
+      <w:tr>
+        <w:tc>
+          <w:tcPr>
+            <w:tcW w:type="dxa" w:w="2160"/>
+          </w:tcPr>
+          <w:p/>
+        </w:tc>
+        <w:tc>
+          <w:tcPr>
+            <w:tcW w:type="dxa" w:w="2160"/>
+          </w:tcPr>
+          <w:p/>
+        </w:tc>
+        <w:tc>
+          <w:tcPr>
+            <w:tcW w:type="dxa" w:w="2160"/>
+          </w:tcPr>
+          <w:p/>
+        </w:tc>
+        <w:tc>
+          <w:tcPr>
+            <w:tcW w:type="dxa" w:w="2160"/>
+          </w:tcPr>
+          <w:p/>
+        </w:tc>
+      </w:tr>
+      <w:tr>
+        <w:tc>
+          <w:tcPr>
+            <w:tcW w:type="dxa" w:w="2160"/>
+          </w:tcPr>
+          <w:p/>
+        </w:tc>
+        <w:tc>
+          <w:tcPr>
+            <w:tcW w:type="dxa" w:w="2160"/>
+          </w:tcPr>
+          <w:p/>
+        </w:tc>
+        <w:tc>
+          <w:tcPr>
+            <w:tcW w:type="dxa" w:w="2160"/>
+          </w:tcPr>
+          <w:p/>
+        </w:tc>
+        <w:tc>
+          <w:tcPr>
+            <w:tcW w:type="dxa" w:w="2160"/>
+          </w:tcPr>
+          <w:p/>
+        </w:tc>
+      </w:tr>
+      <w:tr>
+        <w:tc>
+          <w:tcPr>
+            <w:tcW w:type="dxa" w:w="2160"/>
+          </w:tcPr>
+          <w:p/>
+        </w:tc>
+        <w:tc>
+          <w:tcPr>
+            <w:tcW w:type="dxa" w:w="2160"/>
+          </w:tcPr>
+          <w:p/>
+        </w:tc>
+        <w:tc>
+          <w:tcPr>
+            <w:tcW w:type="dxa" w:w="2160"/>
+          </w:tcPr>
+          <w:p/>
+        </w:tc>
+        <w:tc>
+          <w:tcPr>
+            <w:tcW w:type="dxa" w:w="2160"/>
+          </w:tcPr>
+          <w:p/>
+        </w:tc>
+      </w:tr>
+      <w:tr>
+        <w:tc>
+          <w:tcPr>
+            <w:tcW w:type="dxa" w:w="2160"/>
+          </w:tcPr>
+          <w:p>
+            <w:r>
+              <w:t>{#nganh_bo_sung}{_stt}</w:t>
+            </w:r>
+          </w:p>
+        </w:tc>
+        <w:tc>
+          <w:tcPr>
+            <w:tcW w:type="dxa" w:w="2160"/>
+          </w:tcPr>
+          <w:p>
+            <w:r>
+              <w:t>{ten_nganh}</w:t>
+            </w:r>
+          </w:p>
+        </w:tc>
+        <w:tc>
+          <w:tcPr>
+            <w:tcW w:type="dxa" w:w="2160"/>
+          </w:tcPr>
+          <w:p>
+            <w:r>
+              <w:t>{ma_nganh}</w:t>
+            </w:r>
+          </w:p>
+        </w:tc>
+        <w:tc>
+          <w:tcPr>
+            <w:tcW w:type="dxa" w:w="2160"/>
+          </w:tcPr>
+          <w:p>
+            <w:r>
+              <w:t>{la_nganh_chinh}{/nganh_bo_sung}</w:t>
+            </w:r>
+          </w:p>
+        </w:tc>
+      </w:tr>
+    </w:tbl>
+    <w:p/>
+    <w:p>
+      <w:pPr>
+        <w:spacing w:before="120"/>
+      </w:pPr>
+      <w:r>
+        <w:rPr>
+          <w:rFonts w:ascii="Arial" w:hAnsi="Arial" w:cs="Arial"/>
+          <w:sz w:val="24"/>
+          <w:sz-cs w:val="24"/>
+        </w:rPr>
+        <w:t xml:space="preserve"/>
+      </w:r>
+    </w:p>
+    <w:p>
+      <w:pPr>
+        <w:spacing w:before="120"/>
+      </w:pPr>
+      <w:r>
+        <w:rPr>
+          <w:rFonts w:ascii="Arial" w:hAnsi="Arial" w:cs="Arial"/>
+          <w:sz w:val="24"/>
+          <w:sz-cs w:val="24"/>
+        </w:rPr>
+        <w:t xml:space="preserve"/>
+      </w:r>
+    </w:p>
+    <w:p>
+      <w:pPr>
+        <w:spacing w:before="120"/>
+      </w:pPr>
+      <w:r>
+        <w:rPr>
+          <w:rFonts w:ascii="Arial" w:hAnsi="Arial" w:cs="Arial"/>
+          <w:sz w:val="24"/>
+          <w:sz-cs w:val="24"/>
+        </w:rPr>
+        <w:t xml:space="preserve"/>
+      </w:r>
+    </w:p>
+    <w:p>
+      <w:pPr>
+        <w:spacing w:before="120"/>
+      </w:pPr>
+      <w:r>
+        <w:rPr>
+          <w:rFonts w:ascii="Arial" w:hAnsi="Arial" w:cs="Arial"/>
+          <w:sz w:val="24"/>
+          <w:sz-cs w:val="24"/>
+        </w:rPr>
+        <w:t xml:space="preserve"/>
+      </w:r>
+    </w:p>
+    <w:p>
+      <w:pPr>
+        <w:spacing w:before="120"/>
+      </w:pPr>
+      <w:r>
+        <w:rPr>
+          <w:rFonts w:ascii="Arial" w:hAnsi="Arial" w:cs="Arial"/>
+          <w:sz w:val="24"/>
+          <w:sz-cs w:val="24"/>
+          <w:b/>
+        </w:rPr>
+        <w:t xml:space="preserve">2. Bỏ ngành, nghề kinh doanh</w:t>
+      </w:r>
+      <w:r>
+        <w:rPr>
+          <w:rFonts w:ascii="Arial" w:hAnsi="Arial" w:cs="Arial"/>
+          <w:sz w:val="24"/>
+          <w:sz-cs w:val="24"/>
+          <w:b/>
+          <w:i/>
         </w:rPr>
         <w:t xml:space="preserve"> </w:t>
       </w:r>
@@ -2914,90 +3138,341 @@
           <w:rFonts w:ascii="Arial" w:hAnsi="Arial" w:cs="Arial"/>
           <w:sz w:val="24"/>
           <w:sz-cs w:val="24"/>
-          <w:i/>
-        </w:rPr>
-        <w:t xml:space="preserve">đánh dấu X để chọn một trong các ngành, nghề đã kê khai</w:t>
-      </w:r>
-      <w:r>
-        <w:rPr>
-          <w:rFonts w:ascii="Arial" w:hAnsi="Arial" w:cs="Arial"/>
-          <w:sz w:val="24"/>
-          <w:sz-cs w:val="24"/>
-        </w:rPr>
-        <w:t xml:space="preserve">)</w:t>
-      </w:r>
-    </w:p>
-    <w:p>
-      <w:pPr>
-        <w:spacing w:before="120"/>
-      </w:pPr>
-      <w:r>
-        <w:rPr>
-          <w:rFonts w:ascii="Arial" w:hAnsi="Arial" w:cs="Arial"/>
-          <w:sz w:val="24"/>
-          <w:sz-cs w:val="24"/>
-        </w:rPr>
-        <w:t xml:space="preserve"/>
-      </w:r>
-    </w:p>
-    <w:p>
-      <w:pPr>
-        <w:spacing w:before="120"/>
-      </w:pPr>
-      <w:r>
-        <w:rPr>
-          <w:rFonts w:ascii="Arial" w:hAnsi="Arial" w:cs="Arial"/>
-          <w:sz w:val="24"/>
-          <w:sz-cs w:val="24"/>
-        </w:rPr>
-        <w:t xml:space="preserve"/>
-      </w:r>
-    </w:p>
-    <w:p>
-      <w:pPr>
-        <w:spacing w:before="120"/>
-      </w:pPr>
-      <w:r>
-        <w:rPr>
-          <w:rFonts w:ascii="Arial" w:hAnsi="Arial" w:cs="Arial"/>
-          <w:sz w:val="24"/>
-          <w:sz-cs w:val="24"/>
-        </w:rPr>
-        <w:t xml:space="preserve"/>
-      </w:r>
-    </w:p>
-    <w:p>
-      <w:pPr>
-        <w:spacing w:before="120"/>
-      </w:pPr>
-      <w:r>
-        <w:rPr>
-          <w:rFonts w:ascii="Arial" w:hAnsi="Arial" w:cs="Arial"/>
-          <w:sz w:val="24"/>
-          <w:sz-cs w:val="24"/>
-        </w:rPr>
-        <w:t xml:space="preserve"/>
-      </w:r>
-    </w:p>
-    <w:p>
-      <w:pPr>
-        <w:spacing w:before="120"/>
-      </w:pPr>
-      <w:r>
-        <w:rPr>
-          <w:rFonts w:ascii="Arial" w:hAnsi="Arial" w:cs="Arial"/>
-          <w:sz w:val="24"/>
-          <w:sz-cs w:val="24"/>
           <w:b/>
         </w:rPr>
-        <w:t xml:space="preserve">2. Bỏ ngành, nghề kinh doanh</w:t>
-      </w:r>
+        <w:t xml:space="preserve">sau</w:t>
+      </w:r>
+      <w:r>
+        <w:rPr>
+          <w:rFonts w:ascii="Arial" w:hAnsi="Arial" w:cs="Arial"/>
+          <w:sz w:val="24"/>
+          <w:sz-cs w:val="24"/>
+          <w:i/>
+        </w:rPr>
+        <w:t xml:space="preserve"> </w:t>
+      </w:r>
+      <w:r>
+        <w:rPr>
+          <w:rFonts w:ascii="Arial" w:hAnsi="Arial" w:cs="Arial"/>
+          <w:sz w:val="24"/>
+          <w:sz-cs w:val="24"/>
+        </w:rPr>
+        <w:t xml:space="preserve">(</w:t>
+      </w:r>
+      <w:r>
+        <w:rPr>
+          <w:rFonts w:ascii="Arial" w:hAnsi="Arial" w:cs="Arial"/>
+          <w:sz w:val="24"/>
+          <w:sz-cs w:val="24"/>
+          <w:i/>
+        </w:rPr>
+        <w:t xml:space="preserve">kê khai trong trường hợp doanh nghiệp thông báo bỏ ngành, nghề kinh doanh khỏi danh sách ngành, nghề kinh doanh đã đăng ký với cơ quan đăng ký kinh doanh</w:t>
+      </w:r>
+      <w:r>
+        <w:rPr>
+          <w:rFonts w:ascii="Arial" w:hAnsi="Arial" w:cs="Arial"/>
+          <w:sz w:val="24"/>
+          <w:sz-cs w:val="24"/>
+        </w:rPr>
+        <w:t xml:space="preserve">):</w:t>
+      </w:r>
+    </w:p>
+    <w:tbl>
+      <w:tblPr>
+        <w:tblW w:type="auto" w:w="0"/>
+        <w:tblLook w:firstColumn="1" w:firstRow="1" w:lastColumn="0" w:lastRow="0" w:noHBand="0" w:noVBand="1" w:val="04A0"/>
+        <w:tblBorders>
+          <w:top w:val="single" w:sz="4" w:color="000000"/>
+          <w:left w:val="single" w:sz="4" w:color="000000"/>
+          <w:bottom w:val="single" w:sz="4" w:color="000000"/>
+          <w:right w:val="single" w:sz="4" w:color="000000"/>
+          <w:insideH w:val="single" w:sz="4" w:color="000000"/>
+          <w:insideV w:val="single" w:sz="4" w:color="000000"/>
+        </w:tblBorders>
+      </w:tblPr>
+      <w:tblGrid>
+        <w:gridCol w:w="2160"/>
+        <w:gridCol w:w="2160"/>
+        <w:gridCol w:w="2160"/>
+        <w:gridCol w:w="2160"/>
+      </w:tblGrid>
+      <w:tr>
+        <w:tc>
+          <w:tcPr>
+            <w:tcW w:type="dxa" w:w="2160"/>
+          </w:tcPr>
+          <w:p>
+            <w:r>
+              <w:rPr>
+                <w:b/>
+              </w:rPr>
+              <w:t>STT</w:t>
+            </w:r>
+          </w:p>
+        </w:tc>
+        <w:tc>
+          <w:tcPr>
+            <w:tcW w:type="dxa" w:w="2160"/>
+          </w:tcPr>
+          <w:p>
+            <w:r>
+              <w:rPr>
+                <w:b/>
+              </w:rPr>
+              <w:t>Tên ngành, nghề kinh doanh được bỏ khỏi danh sách đã đăng ký</w:t>
+            </w:r>
+          </w:p>
+        </w:tc>
+        <w:tc>
+          <w:tcPr>
+            <w:tcW w:type="dxa" w:w="2160"/>
+          </w:tcPr>
+          <w:p>
+            <w:r>
+              <w:rPr>
+                <w:b/>
+              </w:rPr>
+              <w:t>Mã ngành</w:t>
+            </w:r>
+          </w:p>
+        </w:tc>
+        <w:tc>
+          <w:tcPr>
+            <w:tcW w:type="dxa" w:w="2160"/>
+          </w:tcPr>
+          <w:p>
+            <w:r>
+              <w:rPr>
+                <w:b/>
+              </w:rPr>
+              <w:t>Ghi chú</w:t>
+            </w:r>
+          </w:p>
+        </w:tc>
+      </w:tr>
+      <w:tr>
+        <w:tc>
+          <w:tcPr>
+            <w:tcW w:type="dxa" w:w="2160"/>
+          </w:tcPr>
+          <w:p/>
+        </w:tc>
+        <w:tc>
+          <w:tcPr>
+            <w:tcW w:type="dxa" w:w="2160"/>
+          </w:tcPr>
+          <w:p/>
+        </w:tc>
+        <w:tc>
+          <w:tcPr>
+            <w:tcW w:type="dxa" w:w="2160"/>
+          </w:tcPr>
+          <w:p/>
+        </w:tc>
+        <w:tc>
+          <w:tcPr>
+            <w:tcW w:type="dxa" w:w="2160"/>
+          </w:tcPr>
+          <w:p/>
+        </w:tc>
+      </w:tr>
+      <w:tr>
+        <w:tc>
+          <w:tcPr>
+            <w:tcW w:type="dxa" w:w="2160"/>
+          </w:tcPr>
+          <w:p/>
+        </w:tc>
+        <w:tc>
+          <w:tcPr>
+            <w:tcW w:type="dxa" w:w="2160"/>
+          </w:tcPr>
+          <w:p/>
+        </w:tc>
+        <w:tc>
+          <w:tcPr>
+            <w:tcW w:type="dxa" w:w="2160"/>
+          </w:tcPr>
+          <w:p/>
+        </w:tc>
+        <w:tc>
+          <w:tcPr>
+            <w:tcW w:type="dxa" w:w="2160"/>
+          </w:tcPr>
+          <w:p/>
+        </w:tc>
+      </w:tr>
+      <w:tr>
+        <w:tc>
+          <w:tcPr>
+            <w:tcW w:type="dxa" w:w="2160"/>
+          </w:tcPr>
+          <w:p/>
+        </w:tc>
+        <w:tc>
+          <w:tcPr>
+            <w:tcW w:type="dxa" w:w="2160"/>
+          </w:tcPr>
+          <w:p/>
+        </w:tc>
+        <w:tc>
+          <w:tcPr>
+            <w:tcW w:type="dxa" w:w="2160"/>
+          </w:tcPr>
+          <w:p/>
+        </w:tc>
+        <w:tc>
+          <w:tcPr>
+            <w:tcW w:type="dxa" w:w="2160"/>
+          </w:tcPr>
+          <w:p/>
+        </w:tc>
+      </w:tr>
+      <w:tr>
+        <w:tc>
+          <w:tcPr>
+            <w:tcW w:type="dxa" w:w="2160"/>
+          </w:tcPr>
+          <w:p/>
+        </w:tc>
+        <w:tc>
+          <w:tcPr>
+            <w:tcW w:type="dxa" w:w="2160"/>
+          </w:tcPr>
+          <w:p/>
+        </w:tc>
+        <w:tc>
+          <w:tcPr>
+            <w:tcW w:type="dxa" w:w="2160"/>
+          </w:tcPr>
+          <w:p/>
+        </w:tc>
+        <w:tc>
+          <w:tcPr>
+            <w:tcW w:type="dxa" w:w="2160"/>
+          </w:tcPr>
+          <w:p/>
+        </w:tc>
+      </w:tr>
+      <w:tr>
+        <w:tc>
+          <w:tcPr>
+            <w:tcW w:type="dxa" w:w="2160"/>
+          </w:tcPr>
+          <w:p>
+            <w:r>
+              <w:t>{#nganh_xoa_bo}{_stt}</w:t>
+            </w:r>
+          </w:p>
+        </w:tc>
+        <w:tc>
+          <w:tcPr>
+            <w:tcW w:type="dxa" w:w="2160"/>
+          </w:tcPr>
+          <w:p>
+            <w:r>
+              <w:t>{ten_nganh}</w:t>
+            </w:r>
+          </w:p>
+        </w:tc>
+        <w:tc>
+          <w:tcPr>
+            <w:tcW w:type="dxa" w:w="2160"/>
+          </w:tcPr>
+          <w:p>
+            <w:r>
+              <w:t>{ma_nganh}</w:t>
+            </w:r>
+          </w:p>
+        </w:tc>
+        <w:tc>
+          <w:tcPr>
+            <w:tcW w:type="dxa" w:w="2160"/>
+          </w:tcPr>
+          <w:p>
+            <w:r>
+              <w:t>{ghi_chu}{/nganh_xoa_bo}</w:t>
+            </w:r>
+          </w:p>
+        </w:tc>
+      </w:tr>
+    </w:tbl>
+    <w:p/>
+    <w:p>
+      <w:pPr>
+        <w:jc w:val="center"/>
+        <w:spacing w:before="120"/>
+      </w:pPr>
+      <w:r>
+        <w:rPr>
+          <w:rFonts w:ascii="Arial" w:hAnsi="Arial" w:cs="Arial"/>
+          <w:sz w:val="24"/>
+          <w:sz-cs w:val="24"/>
+        </w:rPr>
+        <w:t xml:space="preserve"/>
+      </w:r>
+    </w:p>
+    <w:p>
+      <w:pPr>
+        <w:jc w:val="center"/>
+        <w:spacing w:before="120"/>
+      </w:pPr>
+      <w:r>
+        <w:rPr>
+          <w:rFonts w:ascii="Arial" w:hAnsi="Arial" w:cs="Arial"/>
+          <w:sz w:val="24"/>
+          <w:sz-cs w:val="24"/>
+        </w:rPr>
+        <w:t xml:space="preserve"/>
+      </w:r>
+    </w:p>
+    <w:p>
+      <w:pPr>
+        <w:jc w:val="center"/>
+        <w:spacing w:before="120"/>
+      </w:pPr>
+      <w:r>
+        <w:rPr>
+          <w:rFonts w:ascii="Arial" w:hAnsi="Arial" w:cs="Arial"/>
+          <w:sz w:val="24"/>
+          <w:sz-cs w:val="24"/>
+        </w:rPr>
+        <w:t xml:space="preserve"/>
+      </w:r>
+    </w:p>
+    <w:p>
+      <w:pPr>
+        <w:jc w:val="center"/>
+        <w:spacing w:before="120"/>
+      </w:pPr>
+      <w:r>
+        <w:rPr>
+          <w:rFonts w:ascii="Arial" w:hAnsi="Arial" w:cs="Arial"/>
+          <w:sz w:val="24"/>
+          <w:sz-cs w:val="24"/>
+        </w:rPr>
+        <w:t xml:space="preserve"/>
+      </w:r>
+    </w:p>
+    <w:p>
+      <w:pPr>
+        <w:spacing w:before="120"/>
+      </w:pPr>
       <w:r>
         <w:rPr>
           <w:rFonts w:ascii="Arial" w:hAnsi="Arial" w:cs="Arial"/>
           <w:sz w:val="24"/>
           <w:sz-cs w:val="24"/>
           <w:b/>
+        </w:rPr>
+        <w:t xml:space="preserve">3. Sửa đổi chi tiết ngành, nghề kinh doanh sau</w:t>
+      </w:r>
+      <w:r>
+        <w:rPr>
+          <w:rFonts w:ascii="Arial" w:hAnsi="Arial" w:cs="Arial"/>
+          <w:sz w:val="24"/>
+          <w:sz-cs w:val="24"/>
+          <w:b/>
           <w:i/>
         </w:rPr>
         <w:t xml:space="preserve"> </w:t>
@@ -3007,24 +3482,6 @@
           <w:rFonts w:ascii="Arial" w:hAnsi="Arial" w:cs="Arial"/>
           <w:sz w:val="24"/>
           <w:sz-cs w:val="24"/>
-          <w:b/>
-        </w:rPr>
-        <w:t xml:space="preserve">sau</w:t>
-      </w:r>
-      <w:r>
-        <w:rPr>
-          <w:rFonts w:ascii="Arial" w:hAnsi="Arial" w:cs="Arial"/>
-          <w:sz w:val="24"/>
-          <w:sz-cs w:val="24"/>
-          <w:i/>
-        </w:rPr>
-        <w:t xml:space="preserve"> </w:t>
-      </w:r>
-      <w:r>
-        <w:rPr>
-          <w:rFonts w:ascii="Arial" w:hAnsi="Arial" w:cs="Arial"/>
-          <w:sz w:val="24"/>
-          <w:sz-cs w:val="24"/>
         </w:rPr>
         <w:t xml:space="preserve">(</w:t>
       </w:r>
@@ -3035,7 +3492,7 @@
           <w:sz-cs w:val="24"/>
           <w:i/>
         </w:rPr>
-        <w:t xml:space="preserve">kê khai trong trường hợp doanh nghiệp thông báo bỏ ngành, nghề kinh doanh khỏi danh sách ngành, nghề kinh doanh đã đăng ký với cơ quan đăng ký kinh doanh</w:t>
+        <w:t xml:space="preserve">kê khai trong trường hợp doanh nghiệp thông báo thay đổi nội dung chi tiết của ngành, nghề kinh doanh đã đăng ký với cơ quan đăng ký kinh doanh</w:t>
       </w:r>
       <w:r>
         <w:rPr>
@@ -3046,240 +3503,227 @@
         <w:t xml:space="preserve">):</w:t>
       </w:r>
     </w:p>
-    <w:p>
-      <w:pPr>
-        <w:jc w:val="center"/>
-        <w:spacing w:before="120"/>
-      </w:pPr>
-      <w:r>
-        <w:rPr>
-          <w:rFonts w:ascii="Arial" w:hAnsi="Arial" w:cs="Arial"/>
-          <w:sz w:val="24"/>
-          <w:sz-cs w:val="24"/>
-        </w:rPr>
-        <w:t xml:space="preserve">STT</w:t>
-      </w:r>
-    </w:p>
-    <w:p>
-      <w:pPr>
-        <w:jc w:val="center"/>
-        <w:spacing w:before="120"/>
-      </w:pPr>
-      <w:r>
-        <w:rPr>
-          <w:rFonts w:ascii="Arial" w:hAnsi="Arial" w:cs="Arial"/>
-          <w:sz w:val="24"/>
-          <w:sz-cs w:val="24"/>
-        </w:rPr>
-        <w:t xml:space="preserve">Tên ngành, nghề kinh doanh được bỏ khỏi danh sách đã đăng ký</w:t>
-      </w:r>
-    </w:p>
-    <w:p>
-      <w:pPr>
-        <w:jc w:val="center"/>
-        <w:spacing w:before="120"/>
-      </w:pPr>
-      <w:r>
-        <w:rPr>
-          <w:rFonts w:ascii="Arial" w:hAnsi="Arial" w:cs="Arial"/>
-          <w:sz w:val="24"/>
-          <w:sz-cs w:val="24"/>
-        </w:rPr>
-        <w:t xml:space="preserve">Mã ngành</w:t>
-      </w:r>
-    </w:p>
-    <w:p>
-      <w:pPr>
-        <w:jc w:val="center"/>
-        <w:spacing w:before="120"/>
-      </w:pPr>
-      <w:r>
-        <w:rPr>
-          <w:rFonts w:ascii="Arial" w:hAnsi="Arial" w:cs="Arial"/>
-          <w:sz w:val="24"/>
-          <w:sz-cs w:val="24"/>
-        </w:rPr>
-        <w:t xml:space="preserve">Ghi chú</w:t>
-      </w:r>
-    </w:p>
-    <w:p>
-      <w:pPr>
-        <w:jc w:val="center"/>
-        <w:spacing w:before="120"/>
-      </w:pPr>
-      <w:r>
-        <w:rPr>
-          <w:rFonts w:ascii="Arial" w:hAnsi="Arial" w:cs="Arial"/>
-          <w:sz w:val="24"/>
-          <w:sz-cs w:val="24"/>
-        </w:rPr>
-        <w:t xml:space="preserve"/>
-      </w:r>
-    </w:p>
-    <w:p>
-      <w:pPr>
-        <w:jc w:val="center"/>
-        <w:spacing w:before="120"/>
-      </w:pPr>
-      <w:r>
-        <w:rPr>
-          <w:rFonts w:ascii="Arial" w:hAnsi="Arial" w:cs="Arial"/>
-          <w:sz w:val="24"/>
-          <w:sz-cs w:val="24"/>
-        </w:rPr>
-        <w:t xml:space="preserve"/>
-      </w:r>
-    </w:p>
-    <w:p>
-      <w:pPr>
-        <w:jc w:val="center"/>
-        <w:spacing w:before="120"/>
-      </w:pPr>
-      <w:r>
-        <w:rPr>
-          <w:rFonts w:ascii="Arial" w:hAnsi="Arial" w:cs="Arial"/>
-          <w:sz w:val="24"/>
-          <w:sz-cs w:val="24"/>
-        </w:rPr>
-        <w:t xml:space="preserve"/>
-      </w:r>
-    </w:p>
-    <w:p>
-      <w:pPr>
-        <w:jc w:val="center"/>
-        <w:spacing w:before="120"/>
-      </w:pPr>
-      <w:r>
-        <w:rPr>
-          <w:rFonts w:ascii="Arial" w:hAnsi="Arial" w:cs="Arial"/>
-          <w:sz w:val="24"/>
-          <w:sz-cs w:val="24"/>
-        </w:rPr>
-        <w:t xml:space="preserve"/>
-      </w:r>
-    </w:p>
-    <w:p>
-      <w:pPr>
-        <w:spacing w:before="120"/>
-      </w:pPr>
-      <w:r>
-        <w:rPr>
-          <w:rFonts w:ascii="Arial" w:hAnsi="Arial" w:cs="Arial"/>
-          <w:sz w:val="24"/>
-          <w:sz-cs w:val="24"/>
-          <w:b/>
-        </w:rPr>
-        <w:t xml:space="preserve">3. Sửa đổi chi tiết ngành, nghề kinh doanh sau</w:t>
-      </w:r>
-      <w:r>
-        <w:rPr>
-          <w:rFonts w:ascii="Arial" w:hAnsi="Arial" w:cs="Arial"/>
-          <w:sz w:val="24"/>
-          <w:sz-cs w:val="24"/>
-          <w:b/>
-          <w:i/>
-        </w:rPr>
-        <w:t xml:space="preserve"> </w:t>
-      </w:r>
-      <w:r>
-        <w:rPr>
-          <w:rFonts w:ascii="Arial" w:hAnsi="Arial" w:cs="Arial"/>
-          <w:sz w:val="24"/>
-          <w:sz-cs w:val="24"/>
-        </w:rPr>
-        <w:t xml:space="preserve">(</w:t>
-      </w:r>
-      <w:r>
-        <w:rPr>
-          <w:rFonts w:ascii="Arial" w:hAnsi="Arial" w:cs="Arial"/>
-          <w:sz w:val="24"/>
-          <w:sz-cs w:val="24"/>
-          <w:i/>
-        </w:rPr>
-        <w:t xml:space="preserve">kê khai trong trường hợp doanh nghiệp thông báo thay đổi nội dung chi tiết của ngành, nghề kinh doanh đã đăng ký với cơ quan đăng ký kinh doanh</w:t>
-      </w:r>
-      <w:r>
-        <w:rPr>
-          <w:rFonts w:ascii="Arial" w:hAnsi="Arial" w:cs="Arial"/>
-          <w:sz w:val="24"/>
-          <w:sz-cs w:val="24"/>
-        </w:rPr>
-        <w:t xml:space="preserve">):</w:t>
-      </w:r>
-    </w:p>
-    <w:p>
-      <w:pPr>
-        <w:jc w:val="center"/>
-        <w:spacing w:before="120"/>
-      </w:pPr>
-      <w:r>
-        <w:rPr>
-          <w:rFonts w:ascii="Arial" w:hAnsi="Arial" w:cs="Arial"/>
-          <w:sz w:val="24"/>
-          <w:sz-cs w:val="24"/>
-        </w:rPr>
-        <w:t xml:space="preserve">STT</w:t>
-      </w:r>
-    </w:p>
-    <w:p>
-      <w:pPr>
-        <w:jc w:val="center"/>
-        <w:spacing w:before="120"/>
-      </w:pPr>
-      <w:r>
-        <w:rPr>
-          <w:rFonts w:ascii="Arial" w:hAnsi="Arial" w:cs="Arial"/>
-          <w:sz w:val="24"/>
-          <w:sz-cs w:val="24"/>
-        </w:rPr>
-        <w:t xml:space="preserve">Tên ngành, nghề kinh doanh được sửa đổi chi tiết</w:t>
-      </w:r>
-    </w:p>
-    <w:p>
-      <w:pPr>
-        <w:jc w:val="center"/>
-        <w:spacing w:before="120"/>
-      </w:pPr>
-      <w:r>
-        <w:rPr>
-          <w:rFonts w:ascii="Arial" w:hAnsi="Arial" w:cs="Arial"/>
-          <w:sz w:val="24"/>
-          <w:sz-cs w:val="24"/>
-        </w:rPr>
-        <w:t xml:space="preserve">Mã ngành</w:t>
-      </w:r>
-    </w:p>
-    <w:p>
-      <w:pPr>
-        <w:jc w:val="center"/>
-        <w:spacing w:before="120"/>
-      </w:pPr>
-      <w:r>
-        <w:rPr>
-          <w:rFonts w:ascii="Arial" w:hAnsi="Arial" w:cs="Arial"/>
-          <w:sz w:val="24"/>
-          <w:sz-cs w:val="24"/>
-        </w:rPr>
-        <w:t xml:space="preserve">Ngành, nghề kinh doanh chính (</w:t>
-      </w:r>
-      <w:r>
-        <w:rPr>
-          <w:rFonts w:ascii="Arial" w:hAnsi="Arial" w:cs="Arial"/>
-          <w:sz w:val="24"/>
-          <w:sz-cs w:val="24"/>
-          <w:i/>
-        </w:rPr>
-        <w:t xml:space="preserve">Trường hợp ngành, nghề kinh doanh được sửa đổi là ngành, nghề kinh doanh chính thì đánh dấu X để chọn một trong các ngành, nghề đã kê khai</w:t>
-      </w:r>
-      <w:r>
-        <w:rPr>
-          <w:rFonts w:ascii="Arial" w:hAnsi="Arial" w:cs="Arial"/>
-          <w:sz w:val="24"/>
-          <w:sz-cs w:val="24"/>
-        </w:rPr>
-        <w:t xml:space="preserve">)</w:t>
-      </w:r>
-    </w:p>
+    <w:tbl>
+      <w:tblPr>
+        <w:tblW w:type="auto" w:w="0"/>
+        <w:tblLook w:firstColumn="1" w:firstRow="1" w:lastColumn="0" w:lastRow="0" w:noHBand="0" w:noVBand="1" w:val="04A0"/>
+        <w:tblBorders>
+          <w:top w:val="single" w:sz="4" w:color="000000"/>
+          <w:left w:val="single" w:sz="4" w:color="000000"/>
+          <w:bottom w:val="single" w:sz="4" w:color="000000"/>
+          <w:right w:val="single" w:sz="4" w:color="000000"/>
+          <w:insideH w:val="single" w:sz="4" w:color="000000"/>
+          <w:insideV w:val="single" w:sz="4" w:color="000000"/>
+        </w:tblBorders>
+      </w:tblPr>
+      <w:tblGrid>
+        <w:gridCol w:w="2160"/>
+        <w:gridCol w:w="2160"/>
+        <w:gridCol w:w="2160"/>
+        <w:gridCol w:w="2160"/>
+      </w:tblGrid>
+      <w:tr>
+        <w:tc>
+          <w:tcPr>
+            <w:tcW w:type="dxa" w:w="2160"/>
+          </w:tcPr>
+          <w:p>
+            <w:r>
+              <w:rPr>
+                <w:b/>
+              </w:rPr>
+              <w:t>STT</w:t>
+            </w:r>
+          </w:p>
+        </w:tc>
+        <w:tc>
+          <w:tcPr>
+            <w:tcW w:type="dxa" w:w="2160"/>
+          </w:tcPr>
+          <w:p>
+            <w:r>
+              <w:rPr>
+                <w:b/>
+              </w:rPr>
+              <w:t>Tên ngành, nghề kinh doanh được sửa đổi chi tiết</w:t>
+            </w:r>
+          </w:p>
+        </w:tc>
+        <w:tc>
+          <w:tcPr>
+            <w:tcW w:type="dxa" w:w="2160"/>
+          </w:tcPr>
+          <w:p>
+            <w:r>
+              <w:rPr>
+                <w:b/>
+              </w:rPr>
+              <w:t>Mã ngành</w:t>
+            </w:r>
+          </w:p>
+        </w:tc>
+        <w:tc>
+          <w:tcPr>
+            <w:tcW w:type="dxa" w:w="2160"/>
+          </w:tcPr>
+          <w:p>
+            <w:r>
+              <w:rPr>
+                <w:b/>
+              </w:rPr>
+              <w:t>Ngành, nghề kinh doanh chính</w:t>
+            </w:r>
+          </w:p>
+        </w:tc>
+      </w:tr>
+      <w:tr>
+        <w:tc>
+          <w:tcPr>
+            <w:tcW w:type="dxa" w:w="2160"/>
+          </w:tcPr>
+          <w:p/>
+        </w:tc>
+        <w:tc>
+          <w:tcPr>
+            <w:tcW w:type="dxa" w:w="2160"/>
+          </w:tcPr>
+          <w:p/>
+        </w:tc>
+        <w:tc>
+          <w:tcPr>
+            <w:tcW w:type="dxa" w:w="2160"/>
+          </w:tcPr>
+          <w:p/>
+        </w:tc>
+        <w:tc>
+          <w:tcPr>
+            <w:tcW w:type="dxa" w:w="2160"/>
+          </w:tcPr>
+          <w:p/>
+        </w:tc>
+      </w:tr>
+      <w:tr>
+        <w:tc>
+          <w:tcPr>
+            <w:tcW w:type="dxa" w:w="2160"/>
+          </w:tcPr>
+          <w:p/>
+        </w:tc>
+        <w:tc>
+          <w:tcPr>
+            <w:tcW w:type="dxa" w:w="2160"/>
+          </w:tcPr>
+          <w:p/>
+        </w:tc>
+        <w:tc>
+          <w:tcPr>
+            <w:tcW w:type="dxa" w:w="2160"/>
+          </w:tcPr>
+          <w:p/>
+        </w:tc>
+        <w:tc>
+          <w:tcPr>
+            <w:tcW w:type="dxa" w:w="2160"/>
+          </w:tcPr>
+          <w:p/>
+        </w:tc>
+      </w:tr>
+      <w:tr>
+        <w:tc>
+          <w:tcPr>
+            <w:tcW w:type="dxa" w:w="2160"/>
+          </w:tcPr>
+          <w:p/>
+        </w:tc>
+        <w:tc>
+          <w:tcPr>
+            <w:tcW w:type="dxa" w:w="2160"/>
+          </w:tcPr>
+          <w:p/>
+        </w:tc>
+        <w:tc>
+          <w:tcPr>
+            <w:tcW w:type="dxa" w:w="2160"/>
+          </w:tcPr>
+          <w:p/>
+        </w:tc>
+        <w:tc>
+          <w:tcPr>
+            <w:tcW w:type="dxa" w:w="2160"/>
+          </w:tcPr>
+          <w:p/>
+        </w:tc>
+      </w:tr>
+      <w:tr>
+        <w:tc>
+          <w:tcPr>
+            <w:tcW w:type="dxa" w:w="2160"/>
+          </w:tcPr>
+          <w:p/>
+        </w:tc>
+        <w:tc>
+          <w:tcPr>
+            <w:tcW w:type="dxa" w:w="2160"/>
+          </w:tcPr>
+          <w:p/>
+        </w:tc>
+        <w:tc>
+          <w:tcPr>
+            <w:tcW w:type="dxa" w:w="2160"/>
+          </w:tcPr>
+          <w:p/>
+        </w:tc>
+        <w:tc>
+          <w:tcPr>
+            <w:tcW w:type="dxa" w:w="2160"/>
+          </w:tcPr>
+          <w:p/>
+        </w:tc>
+      </w:tr>
+      <w:tr>
+        <w:tc>
+          <w:tcPr>
+            <w:tcW w:type="dxa" w:w="2160"/>
+          </w:tcPr>
+          <w:p>
+            <w:r>
+              <w:t>{#nganh_sua_doi_chi_tiet}{_stt}</w:t>
+            </w:r>
+          </w:p>
+        </w:tc>
+        <w:tc>
+          <w:tcPr>
+            <w:tcW w:type="dxa" w:w="2160"/>
+          </w:tcPr>
+          <w:p>
+            <w:r>
+              <w:t>{ten_nganh}</w:t>
+            </w:r>
+          </w:p>
+        </w:tc>
+        <w:tc>
+          <w:tcPr>
+            <w:tcW w:type="dxa" w:w="2160"/>
+          </w:tcPr>
+          <w:p>
+            <w:r>
+              <w:t>{ma_nganh}</w:t>
+            </w:r>
+          </w:p>
+        </w:tc>
+        <w:tc>
+          <w:tcPr>
+            <w:tcW w:type="dxa" w:w="2160"/>
+          </w:tcPr>
+          <w:p>
+            <w:r>
+              <w:t>{la_nganh_chinh}{/nganh_sua_doi_chi_tiet}</w:t>
+            </w:r>
+          </w:p>
+        </w:tc>
+      </w:tr>
+    </w:tbl>
+    <w:p/>
     <w:p>
       <w:pPr>
         <w:jc w:val="center"/>
@@ -6485,6 +6929,192 @@
     </w:sectPr>
   </w:body>
 </w:document>
+</file>
+
+<file path=word/styles.xml><?xml version="1.0" encoding="utf-8"?>
+<w:styles xmlns:mc="http://schemas.openxmlformats.org/markup-compatibility/2006" xmlns:r="http://schemas.openxmlformats.org/officeDocument/2006/relationships" xmlns:w14="http://schemas.microsoft.com/office/word/2010/wordml" xmlns:w="http://schemas.openxmlformats.org/wordprocessingml/2006/main" mc:Ignorable="w14">
+  <w:docDefaults>
+    <w:rPrDefault>
+      <w:rPr>
+        <w:rFonts w:asciiTheme="minorHAnsi" w:eastAsiaTheme="minorEastAsia" w:hAnsiTheme="minorHAnsi" w:cstheme="minorBidi"/>
+        <w:sz w:val="24"/>
+        <w:szCs w:val="24"/>
+        <w:lang w:val="en-US" w:eastAsia="en-US" w:bidi="ar-SA"/>
+      </w:rPr>
+    </w:rPrDefault>
+    <w:pPrDefault/>
+  </w:docDefaults>
+  <w:latentStyles w:defLockedState="0" w:defUIPriority="99" w:defSemiHidden="1" w:defUnhideWhenUsed="1" w:defQFormat="0" w:count="276">
+    <w:lsdException w:name="Normal" w:semiHidden="0" w:uiPriority="0" w:unhideWhenUsed="0" w:qFormat="1"/>
+    <w:lsdException w:name="heading 1" w:semiHidden="0" w:uiPriority="9" w:unhideWhenUsed="0" w:qFormat="1"/>
+    <w:lsdException w:name="heading 2" w:uiPriority="9" w:qFormat="1"/>
+    <w:lsdException w:name="heading 3" w:uiPriority="9" w:qFormat="1"/>
+    <w:lsdException w:name="heading 4" w:uiPriority="9" w:qFormat="1"/>
+    <w:lsdException w:name="heading 5" w:uiPriority="9" w:qFormat="1"/>
+    <w:lsdException w:name="heading 6" w:uiPriority="9" w:qFormat="1"/>
+    <w:lsdException w:name="heading 7" w:uiPriority="9" w:qFormat="1"/>
+    <w:lsdException w:name="heading 8" w:uiPriority="9" w:qFormat="1"/>
+    <w:lsdException w:name="heading 9" w:uiPriority="9" w:qFormat="1"/>
+    <w:lsdException w:name="toc 1" w:uiPriority="39"/>
+    <w:lsdException w:name="toc 2" w:uiPriority="39"/>
+    <w:lsdException w:name="toc 3" w:uiPriority="39"/>
+    <w:lsdException w:name="toc 4" w:uiPriority="39"/>
+    <w:lsdException w:name="toc 5" w:uiPriority="39"/>
+    <w:lsdException w:name="toc 6" w:uiPriority="39"/>
+    <w:lsdException w:name="toc 7" w:uiPriority="39"/>
+    <w:lsdException w:name="toc 8" w:uiPriority="39"/>
+    <w:lsdException w:name="toc 9" w:uiPriority="39"/>
+    <w:lsdException w:name="caption" w:uiPriority="35" w:qFormat="1"/>
+    <w:lsdException w:name="Title" w:semiHidden="0" w:uiPriority="10" w:unhideWhenUsed="0" w:qFormat="1"/>
+    <w:lsdException w:name="Default Paragraph Font" w:uiPriority="1"/>
+    <w:lsdException w:name="Subtitle" w:semiHidden="0" w:uiPriority="11" w:unhideWhenUsed="0" w:qFormat="1"/>
+    <w:lsdException w:name="Strong" w:semiHidden="0" w:uiPriority="22" w:unhideWhenUsed="0" w:qFormat="1"/>
+    <w:lsdException w:name="Emphasis" w:semiHidden="0" w:uiPriority="20" w:unhideWhenUsed="0" w:qFormat="1"/>
+    <w:lsdException w:name="Table Grid" w:semiHidden="0" w:uiPriority="59" w:unhideWhenUsed="0"/>
+    <w:lsdException w:name="Placeholder Text" w:unhideWhenUsed="0"/>
+    <w:lsdException w:name="No Spacing" w:semiHidden="0" w:uiPriority="1" w:unhideWhenUsed="0" w:qFormat="1"/>
+    <w:lsdException w:name="Light Shading" w:semiHidden="0" w:uiPriority="60" w:unhideWhenUsed="0"/>
+    <w:lsdException w:name="Light List" w:semiHidden="0" w:uiPriority="61" w:unhideWhenUsed="0"/>
+    <w:lsdException w:name="Light Grid" w:semiHidden="0" w:uiPriority="62" w:unhideWhenUsed="0"/>
+    <w:lsdException w:name="Medium Shading 1" w:semiHidden="0" w:uiPriority="63" w:unhideWhenUsed="0"/>
+    <w:lsdException w:name="Medium Shading 2" w:semiHidden="0" w:uiPriority="64" w:unhideWhenUsed="0"/>
+    <w:lsdException w:name="Medium List 1" w:semiHidden="0" w:uiPriority="65" w:unhideWhenUsed="0"/>
+    <w:lsdException w:name="Medium List 2" w:semiHidden="0" w:uiPriority="66" w:unhideWhenUsed="0"/>
+    <w:lsdException w:name="Medium Grid 1" w:semiHidden="0" w:uiPriority="67" w:unhideWhenUsed="0"/>
+    <w:lsdException w:name="Medium Grid 2" w:semiHidden="0" w:uiPriority="68" w:unhideWhenUsed="0"/>
+    <w:lsdException w:name="Medium Grid 3" w:semiHidden="0" w:uiPriority="69" w:unhideWhenUsed="0"/>
+    <w:lsdException w:name="Dark List" w:semiHidden="0" w:uiPriority="70" w:unhideWhenUsed="0"/>
+    <w:lsdException w:name="Colorful Shading" w:semiHidden="0" w:uiPriority="71" w:unhideWhenUsed="0"/>
+    <w:lsdException w:name="Colorful List" w:semiHidden="0" w:uiPriority="72" w:unhideWhenUsed="0"/>
+    <w:lsdException w:name="Colorful Grid" w:semiHidden="0" w:uiPriority="73" w:unhideWhenUsed="0"/>
+    <w:lsdException w:name="Light Shading Accent 1" w:semiHidden="0" w:uiPriority="60" w:unhideWhenUsed="0"/>
+    <w:lsdException w:name="Light List Accent 1" w:semiHidden="0" w:uiPriority="61" w:unhideWhenUsed="0"/>
+    <w:lsdException w:name="Light Grid Accent 1" w:semiHidden="0" w:uiPriority="62" w:unhideWhenUsed="0"/>
+    <w:lsdException w:name="Medium Shading 1 Accent 1" w:semiHidden="0" w:uiPriority="63" w:unhideWhenUsed="0"/>
+    <w:lsdException w:name="Medium Shading 2 Accent 1" w:semiHidden="0" w:uiPriority="64" w:unhideWhenUsed="0"/>
+    <w:lsdException w:name="Medium List 1 Accent 1" w:semiHidden="0" w:uiPriority="65" w:unhideWhenUsed="0"/>
+    <w:lsdException w:name="Revision" w:unhideWhenUsed="0"/>
+    <w:lsdException w:name="List Paragraph" w:semiHidden="0" w:uiPriority="34" w:unhideWhenUsed="0" w:qFormat="1"/>
+    <w:lsdException w:name="Quote" w:semiHidden="0" w:uiPriority="29" w:unhideWhenUsed="0" w:qFormat="1"/>
+    <w:lsdException w:name="Intense Quote" w:semiHidden="0" w:uiPriority="30" w:unhideWhenUsed="0" w:qFormat="1"/>
+    <w:lsdException w:name="Medium List 2 Accent 1" w:semiHidden="0" w:uiPriority="66" w:unhideWhenUsed="0"/>
+    <w:lsdException w:name="Medium Grid 1 Accent 1" w:semiHidden="0" w:uiPriority="67" w:unhideWhenUsed="0"/>
+    <w:lsdException w:name="Medium Grid 2 Accent 1" w:semiHidden="0" w:uiPriority="68" w:unhideWhenUsed="0"/>
+    <w:lsdException w:name="Medium Grid 3 Accent 1" w:semiHidden="0" w:uiPriority="69" w:unhideWhenUsed="0"/>
+    <w:lsdException w:name="Dark List Accent 1" w:semiHidden="0" w:uiPriority="70" w:unhideWhenUsed="0"/>
+    <w:lsdException w:name="Colorful Shading Accent 1" w:semiHidden="0" w:uiPriority="71" w:unhideWhenUsed="0"/>
+    <w:lsdException w:name="Colorful List Accent 1" w:semiHidden="0" w:uiPriority="72" w:unhideWhenUsed="0"/>
+    <w:lsdException w:name="Colorful Grid Accent 1" w:semiHidden="0" w:uiPriority="73" w:unhideWhenUsed="0"/>
+    <w:lsdException w:name="Light Shading Accent 2" w:semiHidden="0" w:uiPriority="60" w:unhideWhenUsed="0"/>
+    <w:lsdException w:name="Light List Accent 2" w:semiHidden="0" w:uiPriority="61" w:unhideWhenUsed="0"/>
+    <w:lsdException w:name="Light Grid Accent 2" w:semiHidden="0" w:uiPriority="62" w:unhideWhenUsed="0"/>
+    <w:lsdException w:name="Medium Shading 1 Accent 2" w:semiHidden="0" w:uiPriority="63" w:unhideWhenUsed="0"/>
+    <w:lsdException w:name="Medium Shading 2 Accent 2" w:semiHidden="0" w:uiPriority="64" w:unhideWhenUsed="0"/>
+    <w:lsdException w:name="Medium List 1 Accent 2" w:semiHidden="0" w:uiPriority="65" w:unhideWhenUsed="0"/>
+    <w:lsdException w:name="Medium List 2 Accent 2" w:semiHidden="0" w:uiPriority="66" w:unhideWhenUsed="0"/>
+    <w:lsdException w:name="Medium Grid 1 Accent 2" w:semiHidden="0" w:uiPriority="67" w:unhideWhenUsed="0"/>
+    <w:lsdException w:name="Medium Grid 2 Accent 2" w:semiHidden="0" w:uiPriority="68" w:unhideWhenUsed="0"/>
+    <w:lsdException w:name="Medium Grid 3 Accent 2" w:semiHidden="0" w:uiPriority="69" w:unhideWhenUsed="0"/>
+    <w:lsdException w:name="Dark List Accent 2" w:semiHidden="0" w:uiPriority="70" w:unhideWhenUsed="0"/>
+    <w:lsdException w:name="Colorful Shading Accent 2" w:semiHidden="0" w:uiPriority="71" w:unhideWhenUsed="0"/>
+    <w:lsdException w:name="Colorful List Accent 2" w:semiHidden="0" w:uiPriority="72" w:unhideWhenUsed="0"/>
+    <w:lsdException w:name="Colorful Grid Accent 2" w:semiHidden="0" w:uiPriority="73" w:unhideWhenUsed="0"/>
+    <w:lsdException w:name="Light Shading Accent 3" w:semiHidden="0" w:uiPriority="60" w:unhideWhenUsed="0"/>
+    <w:lsdException w:name="Light List Accent 3" w:semiHidden="0" w:uiPriority="61" w:unhideWhenUsed="0"/>
+    <w:lsdException w:name="Light Grid Accent 3" w:semiHidden="0" w:uiPriority="62" w:unhideWhenUsed="0"/>
+    <w:lsdException w:name="Medium Shading 1 Accent 3" w:semiHidden="0" w:uiPriority="63" w:unhideWhenUsed="0"/>
+    <w:lsdException w:name="Medium Shading 2 Accent 3" w:semiHidden="0" w:uiPriority="64" w:unhideWhenUsed="0"/>
+    <w:lsdException w:name="Medium List 1 Accent 3" w:semiHidden="0" w:uiPriority="65" w:unhideWhenUsed="0"/>
+    <w:lsdException w:name="Medium List 2 Accent 3" w:semiHidden="0" w:uiPriority="66" w:unhideWhenUsed="0"/>
+    <w:lsdException w:name="Medium Grid 1 Accent 3" w:semiHidden="0" w:uiPriority="67" w:unhideWhenUsed="0"/>
+    <w:lsdException w:name="Medium Grid 2 Accent 3" w:semiHidden="0" w:uiPriority="68" w:unhideWhenUsed="0"/>
+    <w:lsdException w:name="Medium Grid 3 Accent 3" w:semiHidden="0" w:uiPriority="69" w:unhideWhenUsed="0"/>
+    <w:lsdException w:name="Dark List Accent 3" w:semiHidden="0" w:uiPriority="70" w:unhideWhenUsed="0"/>
+    <w:lsdException w:name="Colorful Shading Accent 3" w:semiHidden="0" w:uiPriority="71" w:unhideWhenUsed="0"/>
+    <w:lsdException w:name="Colorful List Accent 3" w:semiHidden="0" w:uiPriority="72" w:unhideWhenUsed="0"/>
+    <w:lsdException w:name="Colorful Grid Accent 3" w:semiHidden="0" w:uiPriority="73" w:unhideWhenUsed="0"/>
+    <w:lsdException w:name="Light Shading Accent 4" w:semiHidden="0" w:uiPriority="60" w:unhideWhenUsed="0"/>
+    <w:lsdException w:name="Light List Accent 4" w:semiHidden="0" w:uiPriority="61" w:unhideWhenUsed="0"/>
+    <w:lsdException w:name="Light Grid Accent 4" w:semiHidden="0" w:uiPriority="62" w:unhideWhenUsed="0"/>
+    <w:lsdException w:name="Medium Shading 1 Accent 4" w:semiHidden="0" w:uiPriority="63" w:unhideWhenUsed="0"/>
+    <w:lsdException w:name="Medium Shading 2 Accent 4" w:semiHidden="0" w:uiPriority="64" w:unhideWhenUsed="0"/>
+    <w:lsdException w:name="Medium List 1 Accent 4" w:semiHidden="0" w:uiPriority="65" w:unhideWhenUsed="0"/>
+    <w:lsdException w:name="Medium List 2 Accent 4" w:semiHidden="0" w:uiPriority="66" w:unhideWhenUsed="0"/>
+    <w:lsdException w:name="Medium Grid 1 Accent 4" w:semiHidden="0" w:uiPriority="67" w:unhideWhenUsed="0"/>
+    <w:lsdException w:name="Medium Grid 2 Accent 4" w:semiHidden="0" w:uiPriority="68" w:unhideWhenUsed="0"/>
+    <w:lsdException w:name="Medium Grid 3 Accent 4" w:semiHidden="0" w:uiPriority="69" w:unhideWhenUsed="0"/>
+    <w:lsdException w:name="Dark List Accent 4" w:semiHidden="0" w:uiPriority="70" w:unhideWhenUsed="0"/>
+    <w:lsdException w:name="Colorful Shading Accent 4" w:semiHidden="0" w:uiPriority="71" w:unhideWhenUsed="0"/>
+    <w:lsdException w:name="Colorful List Accent 4" w:semiHidden="0" w:uiPriority="72" w:unhideWhenUsed="0"/>
+    <w:lsdException w:name="Colorful Grid Accent 4" w:semiHidden="0" w:uiPriority="73" w:unhideWhenUsed="0"/>
+    <w:lsdException w:name="Light Shading Accent 5" w:semiHidden="0" w:uiPriority="60" w:unhideWhenUsed="0"/>
+    <w:lsdException w:name="Light List Accent 5" w:semiHidden="0" w:uiPriority="61" w:unhideWhenUsed="0"/>
+    <w:lsdException w:name="Light Grid Accent 5" w:semiHidden="0" w:uiPriority="62" w:unhideWhenUsed="0"/>
+    <w:lsdException w:name="Medium Shading 1 Accent 5" w:semiHidden="0" w:uiPriority="63" w:unhideWhenUsed="0"/>
+    <w:lsdException w:name="Medium Shading 2 Accent 5" w:semiHidden="0" w:uiPriority="64" w:unhideWhenUsed="0"/>
+    <w:lsdException w:name="Medium List 1 Accent 5" w:semiHidden="0" w:uiPriority="65" w:unhideWhenUsed="0"/>
+    <w:lsdException w:name="Medium List 2 Accent 5" w:semiHidden="0" w:uiPriority="66" w:unhideWhenUsed="0"/>
+    <w:lsdException w:name="Medium Grid 1 Accent 5" w:semiHidden="0" w:uiPriority="67" w:unhideWhenUsed="0"/>
+    <w:lsdException w:name="Medium Grid 2 Accent 5" w:semiHidden="0" w:uiPriority="68" w:unhideWhenUsed="0"/>
+    <w:lsdException w:name="Medium Grid 3 Accent 5" w:semiHidden="0" w:uiPriority="69" w:unhideWhenUsed="0"/>
+    <w:lsdException w:name="Dark List Accent 5" w:semiHidden="0" w:uiPriority="70" w:unhideWhenUsed="0"/>
+    <w:lsdException w:name="Colorful Shading Accent 5" w:semiHidden="0" w:uiPriority="71" w:unhideWhenUsed="0"/>
+    <w:lsdException w:name="Colorful List Accent 5" w:semiHidden="0" w:uiPriority="72" w:unhideWhenUsed="0"/>
+    <w:lsdException w:name="Colorful Grid Accent 5" w:semiHidden="0" w:uiPriority="73" w:unhideWhenUsed="0"/>
+    <w:lsdException w:name="Light Shading Accent 6" w:semiHidden="0" w:uiPriority="60" w:unhideWhenUsed="0"/>
+    <w:lsdException w:name="Light List Accent 6" w:semiHidden="0" w:uiPriority="61" w:unhideWhenUsed="0"/>
+    <w:lsdException w:name="Light Grid Accent 6" w:semiHidden="0" w:uiPriority="62" w:unhideWhenUsed="0"/>
+    <w:lsdException w:name="Medium Shading 1 Accent 6" w:semiHidden="0" w:uiPriority="63" w:unhideWhenUsed="0"/>
+    <w:lsdException w:name="Medium Shading 2 Accent 6" w:semiHidden="0" w:uiPriority="64" w:unhideWhenUsed="0"/>
+    <w:lsdException w:name="Medium List 1 Accent 6" w:semiHidden="0" w:uiPriority="65" w:unhideWhenUsed="0"/>
+    <w:lsdException w:name="Medium List 2 Accent 6" w:semiHidden="0" w:uiPriority="66" w:unhideWhenUsed="0"/>
+    <w:lsdException w:name="Medium Grid 1 Accent 6" w:semiHidden="0" w:uiPriority="67" w:unhideWhenUsed="0"/>
+    <w:lsdException w:name="Medium Grid 2 Accent 6" w:semiHidden="0" w:uiPriority="68" w:unhideWhenUsed="0"/>
+    <w:lsdException w:name="Medium Grid 3 Accent 6" w:semiHidden="0" w:uiPriority="69" w:unhideWhenUsed="0"/>
+    <w:lsdException w:name="Dark List Accent 6" w:semiHidden="0" w:uiPriority="70" w:unhideWhenUsed="0"/>
+    <w:lsdException w:name="Colorful Shading Accent 6" w:semiHidden="0" w:uiPriority="71" w:unhideWhenUsed="0"/>
+    <w:lsdException w:name="Colorful List Accent 6" w:semiHidden="0" w:uiPriority="72" w:unhideWhenUsed="0"/>
+    <w:lsdException w:name="Colorful Grid Accent 6" w:semiHidden="0" w:uiPriority="73" w:unhideWhenUsed="0"/>
+    <w:lsdException w:name="Subtle Emphasis" w:semiHidden="0" w:uiPriority="19" w:unhideWhenUsed="0" w:qFormat="1"/>
+    <w:lsdException w:name="Intense Emphasis" w:semiHidden="0" w:uiPriority="21" w:unhideWhenUsed="0" w:qFormat="1"/>
+    <w:lsdException w:name="Subtle Reference" w:semiHidden="0" w:uiPriority="31" w:unhideWhenUsed="0" w:qFormat="1"/>
+    <w:lsdException w:name="Intense Reference" w:semiHidden="0" w:uiPriority="32" w:unhideWhenUsed="0" w:qFormat="1"/>
+    <w:lsdException w:name="Book Title" w:semiHidden="0" w:uiPriority="33" w:unhideWhenUsed="0" w:qFormat="1"/>
+    <w:lsdException w:name="Bibliography" w:uiPriority="37"/>
+    <w:lsdException w:name="TOC Heading" w:uiPriority="39" w:qFormat="1"/>
+  </w:latentStyles>
+  <w:style w:type="paragraph" w:default="1" w:styleId="Normal">
+    <w:name w:val="Normal"/>
+    <w:qFormat/>
+  </w:style>
+  <w:style w:type="character" w:default="1" w:styleId="DefaultParagraphFont">
+    <w:name w:val="Default Paragraph Font"/>
+    <w:uiPriority w:val="1"/>
+    <w:semiHidden/>
+    <w:unhideWhenUsed/>
+  </w:style>
+  <w:style w:type="table" w:default="1" w:styleId="TableNormal">
+    <w:name w:val="Normal Table"/>
+    <w:uiPriority w:val="99"/>
+    <w:semiHidden/>
+    <w:unhideWhenUsed/>
+    <w:tblPr>
+      <w:tblInd w:w="0" w:type="dxa"/>
+      <w:tblCellMar>
+        <w:top w:w="0" w:type="dxa"/>
+        <w:left w:w="108" w:type="dxa"/>
+        <w:bottom w:w="0" w:type="dxa"/>
+        <w:right w:w="108" w:type="dxa"/>
+      </w:tblCellMar>
+    </w:tblPr>
+  </w:style>
+  <w:style w:type="numbering" w:default="1" w:styleId="NoList">
+    <w:name w:val="No List"/>
+    <w:uiPriority w:val="99"/>
+    <w:semiHidden/>
+    <w:unhideWhenUsed/>
+  </w:style>
+</w:styles>
 </file>
 
 <file path=word/theme/theme1.xml><?xml version="1.0" encoding="utf-8"?>

</xml_diff>

<commit_message>
integ(F0L): regen co chu dich — form_maps + blocks M12 (band header 2x2 current-law p50, mirror dn.ten_tieng_viet) + tagger M72 (build xoa marker) + allowlist audit_expected_diff_files [F0L-integration] (27 entry lane merge bo sot + 3 file moi)
</commit_message>
<xml_diff>
--- a/app/templates/PLI_M12.docx
+++ b/app/templates/PLI_M12.docx
@@ -2,71 +2,157 @@
 <file path=word/document.xml><?xml version="1.0" encoding="utf-8"?>
 <w:document xmlns:ve="http://schemas.openxmlformats.org/markup-compatibility/2006" xmlns:o="urn:schemas-microsoft-com:office:office" xmlns:r="http://schemas.openxmlformats.org/officeDocument/2006/relationships" xmlns:v="urn:schemas-microsoft-com:vml" xmlns:wp="http://schemas.openxmlformats.org/drawingml/2006/wordprocessingDrawing" xmlns:w10="urn:schemas-microsoft-com:office:word" xmlns:w="http://schemas.openxmlformats.org/wordprocessingml/2006/main">
   <w:body>
-    <w:p>
-      <w:pPr>
-        <w:jc w:val="center"/>
-        <w:spacing w:before="120"/>
-      </w:pPr>
-      <w:r>
-        <w:rPr>
-          <w:rFonts w:ascii="Arial" w:hAnsi="Arial" w:cs="Arial"/>
-          <w:sz w:val="24"/>
-          <w:sz-cs w:val="24"/>
-          <w:b/>
-        </w:rPr>
-        <w:t>TÊN DOANH NGHIỆP</w:t>
-        <w:br/>
-        <w:t>---------------</w:t>
-      </w:r>
-    </w:p>
-    <w:p>
-      <w:pPr>
-        <w:jc w:val="center"/>
-        <w:spacing w:before="120"/>
-      </w:pPr>
-      <w:r>
-        <w:rPr>
-          <w:rFonts w:ascii="Arial" w:hAnsi="Arial" w:cs="Arial"/>
-          <w:sz w:val="24"/>
-          <w:sz-cs w:val="24"/>
-          <w:b/>
-        </w:rPr>
-        <w:t xml:space="preserve">CỘNG HÒA XÃ HỘI CHỦ NGHĨA VIỆT NAM</w:t>
-        <w:br/>
-        <w:t xml:space="preserve">Độc lập - Tự do - Hạnh phúc </w:t>
-        <w:br/>
-        <w:t xml:space="preserve">---------------</w:t>
-      </w:r>
-    </w:p>
-    <w:p>
-      <w:pPr>
-        <w:jc w:val="center"/>
-        <w:spacing w:before="120"/>
-      </w:pPr>
-      <w:r>
-        <w:rPr>
-          <w:rFonts w:ascii="Arial" w:hAnsi="Arial" w:cs="Arial"/>
-          <w:sz w:val="24"/>
-          <w:sz-cs w:val="24"/>
-        </w:rPr>
-        <w:t>Số: {so_van_ban}</w:t>
-      </w:r>
-    </w:p>
-    <w:p>
-      <w:pPr>
-        <w:jc w:val="right"/>
-        <w:spacing w:before="120"/>
-      </w:pPr>
-      <w:r>
-        <w:rPr>
-          <w:rFonts w:ascii="Arial" w:hAnsi="Arial" w:cs="Arial"/>
-          <w:sz w:val="24"/>
-          <w:sz-cs w:val="24"/>
-          <w:i/>
-        </w:rPr>
-        <w:t>{dia_diem_ky}, ngày {ngay_ky_vb} tháng {thang_ky_vb} năm {nam_ky_vb}</w:t>
-      </w:r>
-    </w:p>
+    <w:tbl xmlns:ns2="urn:orca:hdr2col">
+      <w:tblPr>
+        <w:tblW w:type="dxa" w:w="8640"/>
+        <w:tblBorders>
+          <w:top w:val="nil"/>
+          <w:left w:val="nil"/>
+          <w:bottom w:val="nil"/>
+          <w:right w:val="nil"/>
+          <w:insideH w:val="nil"/>
+          <w:insideV w:val="nil"/>
+        </w:tblBorders>
+        <w:tblLayout w:type="fixed"/>
+        <w:tblCellMar>
+          <w:left w:w="0" w:type="dxa"/>
+          <w:right w:w="0" w:type="dxa"/>
+        </w:tblCellMar>
+        <w:tblLook w:firstColumn="1" w:firstRow="1" w:lastColumn="0" w:lastRow="0" w:noHBand="0" w:noVBand="1" w:val="04A0"/>
+      </w:tblPr>
+      <w:tblGrid>
+        <w:gridCol w:w="3629"/>
+        <w:gridCol w:w="5011"/>
+      </w:tblGrid>
+      <w:tr>
+        <w:tc>
+          <w:tcPr>
+            <w:tcW w:type="dxa" w:w="3629"/>
+            <w:tcBorders>
+              <w:top w:val="nil"/>
+              <w:left w:val="nil"/>
+              <w:bottom w:val="nil"/>
+              <w:right w:val="nil"/>
+              <w:insideH w:val="nil"/>
+              <w:insideV w:val="nil"/>
+            </w:tcBorders>
+          </w:tcPr>
+          <w:p>
+            <w:pPr>
+              <w:jc w:val="left"/>
+              <w:spacing w:before="120"/>
+            </w:pPr>
+            <w:r>
+              <w:rPr>
+                <w:rFonts w:ascii="Arial" w:hAnsi="Arial" w:cs="Arial"/>
+                <w:sz w:val="24"/>
+                <w:sz-cs w:val="24"/>
+                <w:b/>
+              </w:rPr>
+              <w:t>TÊN DOANH NGHIỆP</w:t>
+              <w:br/>
+              <w:t xml:space="preserve">{dn.ten_tieng_viet}</w:t>
+            </w:r>
+          </w:p>
+        </w:tc>
+        <w:tc>
+          <w:tcPr>
+            <w:tcW w:type="dxa" w:w="5011"/>
+            <w:tcBorders>
+              <w:top w:val="nil"/>
+              <w:left w:val="nil"/>
+              <w:bottom w:val="nil"/>
+              <w:right w:val="nil"/>
+              <w:insideH w:val="nil"/>
+              <w:insideV w:val="nil"/>
+            </w:tcBorders>
+          </w:tcPr>
+          <w:p>
+            <w:pPr>
+              <w:jc w:val="center"/>
+              <w:spacing w:before="120"/>
+            </w:pPr>
+            <w:r>
+              <w:rPr>
+                <w:rFonts w:ascii="Arial" w:hAnsi="Arial" w:cs="Arial"/>
+                <w:sz w:val="24"/>
+                <w:sz-cs w:val="24"/>
+                <w:b/>
+              </w:rPr>
+              <w:t xml:space="preserve">CỘNG HÒA XÃ HỘI CHỦ NGHĨA VIỆT NAM</w:t>
+              <w:br/>
+            </w:r>
+            <w:r>
+              <w:rPr>
+                <w:rFonts w:ascii="Arial" w:hAnsi="Arial" w:cs="Arial"/>
+                <w:sz w:val="24"/>
+                <w:sz-cs w:val="24"/>
+                <w:b/>
+                <w:u w:val="single"/>
+              </w:rPr>
+              <w:t xml:space="preserve">Độc lập - Tự do - Hạnh phúc </w:t>
+            </w:r>
+          </w:p>
+        </w:tc>
+      </w:tr>
+      <w:tr>
+        <w:tc>
+          <w:tcPr>
+            <w:tcW w:type="dxa" w:w="3629"/>
+            <w:tcBorders>
+              <w:top w:val="nil"/>
+              <w:left w:val="nil"/>
+              <w:bottom w:val="nil"/>
+              <w:right w:val="nil"/>
+              <w:insideH w:val="nil"/>
+              <w:insideV w:val="nil"/>
+            </w:tcBorders>
+          </w:tcPr>
+          <w:p>
+            <w:pPr>
+              <w:jc w:val="left"/>
+              <w:spacing w:before="120"/>
+            </w:pPr>
+            <w:r>
+              <w:rPr>
+                <w:rFonts w:ascii="Arial" w:hAnsi="Arial" w:cs="Arial"/>
+                <w:sz w:val="24"/>
+                <w:sz-cs w:val="24"/>
+              </w:rPr>
+              <w:t>Số: {so_van_ban}</w:t>
+            </w:r>
+          </w:p>
+        </w:tc>
+        <w:tc>
+          <w:tcPr>
+            <w:tcW w:type="dxa" w:w="5011"/>
+            <w:tcBorders>
+              <w:top w:val="nil"/>
+              <w:left w:val="nil"/>
+              <w:bottom w:val="nil"/>
+              <w:right w:val="nil"/>
+              <w:insideH w:val="nil"/>
+              <w:insideV w:val="nil"/>
+            </w:tcBorders>
+          </w:tcPr>
+          <w:p>
+            <w:pPr>
+              <w:jc w:val="right"/>
+              <w:spacing w:before="120"/>
+            </w:pPr>
+            <w:r>
+              <w:rPr>
+                <w:rFonts w:ascii="Arial" w:hAnsi="Arial" w:cs="Arial"/>
+                <w:sz w:val="24"/>
+                <w:sz-cs w:val="24"/>
+                <w:i/>
+              </w:rPr>
+              <w:t>{dia_diem_ky}, ngày {ngay_ky_vb} tháng {thang_ky_vb} năm {nam_ky_vb}</w:t>
+            </w:r>
+          </w:p>
+        </w:tc>
+      </w:tr>
+    </w:tbl>
     <w:p>
       <w:pPr>
         <w:spacing w:before="120"/>

</xml_diff>

<commit_message>
fix(f1in-lead): rebaseline pin phase5r_tables + policies sau merge F1-IN — 87 w:tblGrid, M12 9 bảng (band+8 matrix O2), wide fixture PLII_M02#8/PLI_M12#8, m12 census materialized (M12_BLOCKED rỗng)
</commit_message>
<xml_diff>
--- a/app/templates/PLI_M12.docx
+++ b/app/templates/PLI_M12.docx
@@ -2,7 +2,7 @@
 <file path=word/document.xml><?xml version="1.0" encoding="utf-8"?>
 <w:document xmlns:ve="http://schemas.openxmlformats.org/markup-compatibility/2006" xmlns:o="urn:schemas-microsoft-com:office:office" xmlns:r="http://schemas.openxmlformats.org/officeDocument/2006/relationships" xmlns:v="urn:schemas-microsoft-com:vml" xmlns:wp="http://schemas.openxmlformats.org/drawingml/2006/wordprocessingDrawing" xmlns:w10="urn:schemas-microsoft-com:office:word" xmlns:w="http://schemas.openxmlformats.org/wordprocessingml/2006/main">
   <w:body>
-    <w:tbl xmlns:ns2="urn:orca:hdr2col">
+    <w:tbl xmlns:ns5="urn:orca:hdr2col">
       <w:tblPr>
         <w:tblW w:type="dxa" w:w="8640"/>
         <w:tblBorders>
@@ -1784,6 +1784,1083 @@
         <w:t xml:space="preserve">Tài sản góp vốn sau khi thay đổi vốn điều lệ: </w:t>
       </w:r>
     </w:p>
+    <w:tbl xmlns:ns2="urn:orca:p1b-temp">
+      <w:tblPr>
+        <w:tblW w:type="auto" w:w="0"/>
+        <w:tblLook w:firstColumn="1" w:firstRow="1" w:lastColumn="0" w:lastRow="0" w:noHBand="0" w:noVBand="1" w:val="04A0"/>
+        <w:tblBorders>
+          <w:top w:val="single" w:sz="4" w:color="000000"/>
+          <w:left w:val="single" w:sz="4" w:color="000000"/>
+          <w:bottom w:val="single" w:sz="4" w:color="000000"/>
+          <w:right w:val="single" w:sz="4" w:color="000000"/>
+          <w:insideH w:val="single" w:sz="4" w:color="000000"/>
+          <w:insideV w:val="single" w:sz="4" w:color="000000"/>
+        </w:tblBorders>
+      </w:tblPr>
+      <w:tblGrid>
+        <w:gridCol w:w="2160"/>
+        <w:gridCol w:w="2160"/>
+        <w:gridCol w:w="2160"/>
+        <w:gridCol w:w="2160"/>
+      </w:tblGrid>
+      <w:tr>
+        <w:tc>
+          <w:tcPr>
+            <w:tcW w:type="dxa" w:w="2160"/>
+          </w:tcPr>
+          <w:p>
+            <w:r>
+              <w:rPr>
+                <w:b/>
+              </w:rPr>
+              <w:t>Tài sản góp vốn</w:t>
+            </w:r>
+          </w:p>
+        </w:tc>
+        <w:tc>
+          <w:tcPr>
+            <w:tcW w:type="dxa" w:w="2160"/>
+          </w:tcPr>
+          <w:p>
+            <w:r>
+              <w:rPr>
+                <w:b/>
+              </w:rPr>
+              <w:t>Ghi rõ loại ngoại tệ, số tiền được góp bằng mỗi loại ngoại tệ / loại tài sản, số lượng và giá trị còn lại của mỗi loại tài sản</w:t>
+            </w:r>
+          </w:p>
+        </w:tc>
+        <w:tc>
+          <w:tcPr>
+            <w:tcW w:type="dxa" w:w="2160"/>
+          </w:tcPr>
+          <w:p>
+            <w:r>
+              <w:rPr>
+                <w:b/>
+              </w:rPr>
+              <w:t>Giá trị vốn của từng tài sản trong vốn điều lệ (bằng số, VNĐ)</w:t>
+            </w:r>
+          </w:p>
+        </w:tc>
+        <w:tc>
+          <w:tcPr>
+            <w:tcW w:type="dxa" w:w="2160"/>
+          </w:tcPr>
+          <w:p>
+            <w:r>
+              <w:rPr>
+                <w:b/>
+              </w:rPr>
+              <w:t>Tỷ lệ (%)</w:t>
+            </w:r>
+          </w:p>
+        </w:tc>
+      </w:tr>
+      <w:tr>
+        <w:tc>
+          <w:tcPr>
+            <w:tcW w:type="dxa" w:w="2160"/>
+          </w:tcPr>
+          <w:p>
+            <w:r>
+              <w:rPr>
+                <w:b w:val="0"/>
+              </w:rPr>
+              <w:t>Đồng Việt Nam</w:t>
+            </w:r>
+          </w:p>
+        </w:tc>
+        <w:tc>
+          <w:tcPr>
+            <w:tcW w:type="dxa" w:w="2160"/>
+          </w:tcPr>
+          <w:p>
+            <w:r>
+              <w:rPr>
+                <w:b w:val="0"/>
+              </w:rPr>
+              <w:t>{co_cau_tai_san_gop_von_sau_thay_doi_vdl.dong_viet_nam.chi_tiet_ngoai_te_tai_san_khac}</w:t>
+            </w:r>
+          </w:p>
+        </w:tc>
+        <w:tc>
+          <w:tcPr>
+            <w:tcW w:type="dxa" w:w="2160"/>
+          </w:tcPr>
+          <w:p>
+            <w:r>
+              <w:rPr>
+                <w:b w:val="0"/>
+              </w:rPr>
+              <w:t>{co_cau_tai_san_gop_von_sau_thay_doi_vdl.dong_viet_nam.gia_tri_vnd}</w:t>
+            </w:r>
+          </w:p>
+        </w:tc>
+        <w:tc>
+          <w:tcPr>
+            <w:tcW w:type="dxa" w:w="2160"/>
+          </w:tcPr>
+          <w:p>
+            <w:r>
+              <w:rPr>
+                <w:b w:val="0"/>
+              </w:rPr>
+              <w:t>{co_cau_tai_san_gop_von_sau_thay_doi_vdl.dong_viet_nam.ty_le}</w:t>
+            </w:r>
+          </w:p>
+        </w:tc>
+      </w:tr>
+      <w:tr>
+        <w:tc>
+          <w:tcPr>
+            <w:tcW w:type="dxa" w:w="2160"/>
+          </w:tcPr>
+          <w:p>
+            <w:r>
+              <w:rPr>
+                <w:b w:val="0"/>
+              </w:rPr>
+              <w:t>Ngoại tệ tự do chuyển đổi (ghi rõ loại ngoại tệ, số tiền được góp bằng mỗi loại ngoại tệ)</w:t>
+            </w:r>
+          </w:p>
+        </w:tc>
+        <w:tc>
+          <w:tcPr>
+            <w:tcW w:type="dxa" w:w="2160"/>
+          </w:tcPr>
+          <w:p>
+            <w:r>
+              <w:rPr>
+                <w:b w:val="0"/>
+              </w:rPr>
+              <w:t>{co_cau_tai_san_gop_von_sau_thay_doi_vdl.ngoai_te_tu_do_chuyen_doi.chi_tiet_ngoai_te_tai_san_khac}</w:t>
+            </w:r>
+          </w:p>
+        </w:tc>
+        <w:tc>
+          <w:tcPr>
+            <w:tcW w:type="dxa" w:w="2160"/>
+          </w:tcPr>
+          <w:p>
+            <w:r>
+              <w:rPr>
+                <w:b w:val="0"/>
+              </w:rPr>
+              <w:t>{co_cau_tai_san_gop_von_sau_thay_doi_vdl.ngoai_te_tu_do_chuyen_doi.gia_tri_vnd}</w:t>
+            </w:r>
+          </w:p>
+        </w:tc>
+        <w:tc>
+          <w:tcPr>
+            <w:tcW w:type="dxa" w:w="2160"/>
+          </w:tcPr>
+          <w:p>
+            <w:r>
+              <w:rPr>
+                <w:b w:val="0"/>
+              </w:rPr>
+              <w:t>{co_cau_tai_san_gop_von_sau_thay_doi_vdl.ngoai_te_tu_do_chuyen_doi.ty_le}</w:t>
+            </w:r>
+          </w:p>
+        </w:tc>
+      </w:tr>
+      <w:tr>
+        <w:tc>
+          <w:tcPr>
+            <w:tcW w:type="dxa" w:w="2160"/>
+          </w:tcPr>
+          <w:p>
+            <w:r>
+              <w:rPr>
+                <w:b w:val="0"/>
+              </w:rPr>
+              <w:t>Vàng</w:t>
+            </w:r>
+          </w:p>
+        </w:tc>
+        <w:tc>
+          <w:tcPr>
+            <w:tcW w:type="dxa" w:w="2160"/>
+          </w:tcPr>
+          <w:p>
+            <w:r>
+              <w:rPr>
+                <w:b w:val="0"/>
+              </w:rPr>
+              <w:t>{co_cau_tai_san_gop_von_sau_thay_doi_vdl.vang.chi_tiet_ngoai_te_tai_san_khac}</w:t>
+            </w:r>
+          </w:p>
+        </w:tc>
+        <w:tc>
+          <w:tcPr>
+            <w:tcW w:type="dxa" w:w="2160"/>
+          </w:tcPr>
+          <w:p>
+            <w:r>
+              <w:rPr>
+                <w:b w:val="0"/>
+              </w:rPr>
+              <w:t>{co_cau_tai_san_gop_von_sau_thay_doi_vdl.vang.gia_tri_vnd}</w:t>
+            </w:r>
+          </w:p>
+        </w:tc>
+        <w:tc>
+          <w:tcPr>
+            <w:tcW w:type="dxa" w:w="2160"/>
+          </w:tcPr>
+          <w:p>
+            <w:r>
+              <w:rPr>
+                <w:b w:val="0"/>
+              </w:rPr>
+              <w:t>{co_cau_tai_san_gop_von_sau_thay_doi_vdl.vang.ty_le}</w:t>
+            </w:r>
+          </w:p>
+        </w:tc>
+      </w:tr>
+      <w:tr>
+        <w:tc>
+          <w:tcPr>
+            <w:tcW w:type="dxa" w:w="2160"/>
+          </w:tcPr>
+          <w:p>
+            <w:r>
+              <w:rPr>
+                <w:b w:val="0"/>
+              </w:rPr>
+              <w:t>Quyền sử dụng đất</w:t>
+            </w:r>
+          </w:p>
+        </w:tc>
+        <w:tc>
+          <w:tcPr>
+            <w:tcW w:type="dxa" w:w="2160"/>
+          </w:tcPr>
+          <w:p>
+            <w:r>
+              <w:rPr>
+                <w:b w:val="0"/>
+              </w:rPr>
+              <w:t>{co_cau_tai_san_gop_von_sau_thay_doi_vdl.quyen_su_dung_dat.chi_tiet_ngoai_te_tai_san_khac}</w:t>
+            </w:r>
+          </w:p>
+        </w:tc>
+        <w:tc>
+          <w:tcPr>
+            <w:tcW w:type="dxa" w:w="2160"/>
+          </w:tcPr>
+          <w:p>
+            <w:r>
+              <w:rPr>
+                <w:b w:val="0"/>
+              </w:rPr>
+              <w:t>{co_cau_tai_san_gop_von_sau_thay_doi_vdl.quyen_su_dung_dat.gia_tri_vnd}</w:t>
+            </w:r>
+          </w:p>
+        </w:tc>
+        <w:tc>
+          <w:tcPr>
+            <w:tcW w:type="dxa" w:w="2160"/>
+          </w:tcPr>
+          <w:p>
+            <w:r>
+              <w:rPr>
+                <w:b w:val="0"/>
+              </w:rPr>
+              <w:t>{co_cau_tai_san_gop_von_sau_thay_doi_vdl.quyen_su_dung_dat.ty_le}</w:t>
+            </w:r>
+          </w:p>
+        </w:tc>
+      </w:tr>
+      <w:tr>
+        <w:tc>
+          <w:tcPr>
+            <w:tcW w:type="dxa" w:w="2160"/>
+          </w:tcPr>
+          <w:p>
+            <w:r>
+              <w:rPr>
+                <w:b w:val="0"/>
+              </w:rPr>
+              <w:t>Quyền sở hữu trí tuệ</w:t>
+            </w:r>
+          </w:p>
+        </w:tc>
+        <w:tc>
+          <w:tcPr>
+            <w:tcW w:type="dxa" w:w="2160"/>
+          </w:tcPr>
+          <w:p>
+            <w:r>
+              <w:rPr>
+                <w:b w:val="0"/>
+              </w:rPr>
+              <w:t>{co_cau_tai_san_gop_von_sau_thay_doi_vdl.quyen_so_huu_tri_tue.chi_tiet_ngoai_te_tai_san_khac}</w:t>
+            </w:r>
+          </w:p>
+        </w:tc>
+        <w:tc>
+          <w:tcPr>
+            <w:tcW w:type="dxa" w:w="2160"/>
+          </w:tcPr>
+          <w:p>
+            <w:r>
+              <w:rPr>
+                <w:b w:val="0"/>
+              </w:rPr>
+              <w:t>{co_cau_tai_san_gop_von_sau_thay_doi_vdl.quyen_so_huu_tri_tue.gia_tri_vnd}</w:t>
+            </w:r>
+          </w:p>
+        </w:tc>
+        <w:tc>
+          <w:tcPr>
+            <w:tcW w:type="dxa" w:w="2160"/>
+          </w:tcPr>
+          <w:p>
+            <w:r>
+              <w:rPr>
+                <w:b w:val="0"/>
+              </w:rPr>
+              <w:t>{co_cau_tai_san_gop_von_sau_thay_doi_vdl.quyen_so_huu_tri_tue.ty_le}</w:t>
+            </w:r>
+          </w:p>
+        </w:tc>
+      </w:tr>
+      <w:tr>
+        <w:tc>
+          <w:tcPr>
+            <w:tcW w:type="dxa" w:w="2160"/>
+          </w:tcPr>
+          <w:p>
+            <w:r>
+              <w:rPr>
+                <w:b w:val="0"/>
+              </w:rPr>
+              <w:t>Các tài sản khác (ghi rõ loại tài sản, số lượng và giá trị còn lại của mỗi loại tài sản, có thể lập thành danh mục riêng kèm theo hồ sơ đăng ký doanh nghiệp)</w:t>
+            </w:r>
+          </w:p>
+        </w:tc>
+        <w:tc>
+          <w:tcPr>
+            <w:tcW w:type="dxa" w:w="2160"/>
+          </w:tcPr>
+          <w:p>
+            <w:r>
+              <w:rPr>
+                <w:b w:val="0"/>
+              </w:rPr>
+              <w:t>{co_cau_tai_san_gop_von_sau_thay_doi_vdl.tai_san_khac.chi_tiet_ngoai_te_tai_san_khac}</w:t>
+            </w:r>
+          </w:p>
+        </w:tc>
+        <w:tc>
+          <w:tcPr>
+            <w:tcW w:type="dxa" w:w="2160"/>
+          </w:tcPr>
+          <w:p>
+            <w:r>
+              <w:rPr>
+                <w:b w:val="0"/>
+              </w:rPr>
+              <w:t>{co_cau_tai_san_gop_von_sau_thay_doi_vdl.tai_san_khac.gia_tri_vnd}</w:t>
+            </w:r>
+          </w:p>
+        </w:tc>
+        <w:tc>
+          <w:tcPr>
+            <w:tcW w:type="dxa" w:w="2160"/>
+          </w:tcPr>
+          <w:p>
+            <w:r>
+              <w:rPr>
+                <w:b w:val="0"/>
+              </w:rPr>
+              <w:t>{co_cau_tai_san_gop_von_sau_thay_doi_vdl.tai_san_khac.ty_le}</w:t>
+            </w:r>
+          </w:p>
+        </w:tc>
+      </w:tr>
+      <w:tr>
+        <w:tc>
+          <w:tcPr>
+            <w:tcW w:type="dxa" w:w="2160"/>
+          </w:tcPr>
+          <w:p>
+            <w:r>
+              <w:rPr>
+                <w:b w:val="0"/>
+              </w:rPr>
+              <w:t>Tổng số</w:t>
+            </w:r>
+          </w:p>
+        </w:tc>
+        <w:tc>
+          <w:tcPr>
+            <w:tcW w:type="dxa" w:w="2160"/>
+          </w:tcPr>
+          <w:p>
+            <w:r>
+              <w:rPr>
+                <w:b w:val="0"/>
+              </w:rPr>
+              <w:t>{co_cau_tai_san_gop_von_sau_thay_doi_vdl.tong_so.chi_tiet_ngoai_te_tai_san_khac}</w:t>
+            </w:r>
+          </w:p>
+        </w:tc>
+        <w:tc>
+          <w:tcPr>
+            <w:tcW w:type="dxa" w:w="2160"/>
+          </w:tcPr>
+          <w:p>
+            <w:r>
+              <w:rPr>
+                <w:b w:val="0"/>
+              </w:rPr>
+              <w:t>{co_cau_tai_san_gop_von_sau_thay_doi_vdl.tong_so.gia_tri_vnd}</w:t>
+            </w:r>
+          </w:p>
+        </w:tc>
+        <w:tc>
+          <w:tcPr>
+            <w:tcW w:type="dxa" w:w="2160"/>
+          </w:tcPr>
+          <w:p>
+            <w:r>
+              <w:rPr>
+                <w:b w:val="0"/>
+              </w:rPr>
+              <w:t>{co_cau_tai_san_gop_von_sau_thay_doi_vdl.tong_so.ty_le}</w:t>
+            </w:r>
+          </w:p>
+        </w:tc>
+      </w:tr>
+    </w:tbl>
+    <w:p/>
+    <w:p>
+      <w:pPr>
+        <w:spacing w:before="120"/>
+      </w:pPr>
+      <w:r>
+        <w:rPr>
+          <w:rFonts w:ascii="Arial" w:hAnsi="Arial" w:cs="Arial"/>
+          <w:sz w:val="24"/>
+          <w:sz-cs w:val="24"/>
+        </w:rPr>
+        <w:t xml:space="preserve"/>
+      </w:r>
+    </w:p>
+    <w:p>
+      <w:pPr>
+        <w:spacing w:before="120"/>
+      </w:pPr>
+      <w:r>
+        <w:rPr>
+          <w:rFonts w:ascii="Arial" w:hAnsi="Arial" w:cs="Arial"/>
+          <w:sz w:val="24"/>
+          <w:sz-cs w:val="24"/>
+        </w:rPr>
+        <w:t xml:space="preserve"/>
+      </w:r>
+    </w:p>
+    <w:p>
+      <w:pPr>
+        <w:spacing w:before="120"/>
+      </w:pPr>
+      <w:r>
+        <w:rPr>
+          <w:rFonts w:ascii="Arial" w:hAnsi="Arial" w:cs="Arial"/>
+          <w:sz w:val="24"/>
+          <w:sz-cs w:val="24"/>
+        </w:rPr>
+        <w:t xml:space="preserve"/>
+      </w:r>
+    </w:p>
+    <w:p>
+      <w:pPr>
+        <w:spacing w:before="120"/>
+      </w:pPr>
+      <w:r>
+        <w:rPr>
+          <w:rFonts w:ascii="Arial" w:hAnsi="Arial" w:cs="Arial"/>
+          <w:sz w:val="24"/>
+          <w:sz-cs w:val="24"/>
+        </w:rPr>
+        <w:t xml:space="preserve"/>
+      </w:r>
+    </w:p>
+    <w:p>
+      <w:pPr>
+        <w:spacing w:before="120"/>
+      </w:pPr>
+      <w:r>
+        <w:rPr>
+          <w:rFonts w:ascii="Arial" w:hAnsi="Arial" w:cs="Arial"/>
+          <w:sz w:val="24"/>
+          <w:sz-cs w:val="24"/>
+        </w:rPr>
+        <w:t xml:space="preserve"/>
+      </w:r>
+    </w:p>
+    <w:p>
+      <w:pPr>
+        <w:spacing w:before="120"/>
+      </w:pPr>
+      <w:r>
+        <w:rPr>
+          <w:rFonts w:ascii="Arial" w:hAnsi="Arial" w:cs="Arial"/>
+          <w:sz w:val="24"/>
+          <w:sz-cs w:val="24"/>
+        </w:rPr>
+        <w:t xml:space="preserve"/>
+      </w:r>
+    </w:p>
+    <w:p>
+      <w:pPr>
+        <w:spacing w:before="120"/>
+      </w:pPr>
+      <w:r>
+        <w:rPr>
+          <w:rFonts w:ascii="Arial" w:hAnsi="Arial" w:cs="Arial"/>
+          <w:sz w:val="24"/>
+          <w:sz-cs w:val="24"/>
+        </w:rPr>
+        <w:t xml:space="preserve"/>
+      </w:r>
+    </w:p>
+    <w:p>
+      <w:pPr>
+        <w:spacing w:before="120"/>
+      </w:pPr>
+      <w:r>
+        <w:rPr>
+          <w:rFonts w:ascii="Arial" w:hAnsi="Arial" w:cs="Arial"/>
+          <w:sz w:val="24"/>
+          <w:sz-cs w:val="24"/>
+        </w:rPr>
+        <w:t xml:space="preserve"/>
+      </w:r>
+    </w:p>
+    <w:p>
+      <w:pPr>
+        <w:spacing w:before="120"/>
+      </w:pPr>
+      <w:r>
+        <w:rPr>
+          <w:rFonts w:ascii="Arial" w:hAnsi="Arial" w:cs="Arial"/>
+          <w:sz w:val="24"/>
+          <w:sz-cs w:val="24"/>
+        </w:rPr>
+        <w:t xml:space="preserve"/>
+      </w:r>
+    </w:p>
+    <w:p>
+      <w:pPr>
+        <w:spacing w:before="120"/>
+      </w:pPr>
+      <w:r>
+        <w:rPr>
+          <w:rFonts w:ascii="Arial" w:hAnsi="Arial" w:cs="Arial"/>
+          <w:sz w:val="24"/>
+          <w:sz-cs w:val="24"/>
+        </w:rPr>
+        <w:t xml:space="preserve"/>
+      </w:r>
+    </w:p>
+    <w:p>
+      <w:pPr>
+        <w:spacing w:before="120"/>
+      </w:pPr>
+      <w:r>
+        <w:rPr>
+          <w:rFonts w:ascii="Arial" w:hAnsi="Arial" w:cs="Arial"/>
+          <w:sz w:val="24"/>
+          <w:sz-cs w:val="24"/>
+        </w:rPr>
+        <w:t xml:space="preserve"/>
+      </w:r>
+    </w:p>
+    <w:p>
+      <w:pPr>
+        <w:spacing w:before="120"/>
+      </w:pPr>
+      <w:r>
+        <w:rPr>
+          <w:rFonts w:ascii="Arial" w:hAnsi="Arial" w:cs="Arial"/>
+          <w:sz w:val="24"/>
+          <w:sz-cs w:val="24"/>
+        </w:rPr>
+        <w:t xml:space="preserve"/>
+      </w:r>
+    </w:p>
+    <w:p>
+      <w:pPr>
+        <w:spacing w:before="120"/>
+      </w:pPr>
+      <w:r>
+        <w:rPr>
+          <w:rFonts w:ascii="Arial" w:hAnsi="Arial" w:cs="Arial"/>
+          <w:sz w:val="24"/>
+          <w:sz-cs w:val="24"/>
+        </w:rPr>
+        <w:t xml:space="preserve"/>
+      </w:r>
+    </w:p>
+    <w:p>
+      <w:pPr>
+        <w:spacing w:before="120"/>
+      </w:pPr>
+      <w:r>
+        <w:rPr>
+          <w:rFonts w:ascii="Arial" w:hAnsi="Arial" w:cs="Arial"/>
+          <w:sz w:val="24"/>
+          <w:sz-cs w:val="24"/>
+        </w:rPr>
+        <w:t xml:space="preserve"/>
+      </w:r>
+    </w:p>
+    <w:p>
+      <w:pPr>
+        <w:spacing w:before="120"/>
+      </w:pPr>
+      <w:r>
+        <w:rPr>
+          <w:rFonts w:ascii="Arial" w:hAnsi="Arial" w:cs="Arial"/>
+          <w:sz w:val="24"/>
+          <w:sz-cs w:val="24"/>
+        </w:rPr>
+        <w:t xml:space="preserve">Thông tin về cổ phần (</w:t>
+      </w:r>
+      <w:r>
+        <w:rPr>
+          <w:rFonts w:ascii="Arial" w:hAnsi="Arial" w:cs="Arial"/>
+          <w:sz w:val="24"/>
+          <w:sz-cs w:val="24"/>
+          <w:i/>
+        </w:rPr>
+        <w:t xml:space="preserve">chỉ kê khai đối với công ty cổ phần</w:t>
+      </w:r>
+      <w:r>
+        <w:rPr>
+          <w:rFonts w:ascii="Arial" w:hAnsi="Arial" w:cs="Arial"/>
+          <w:sz w:val="24"/>
+          <w:sz-cs w:val="24"/>
+        </w:rPr>
+        <w:t xml:space="preserve">):</w:t>
+      </w:r>
+    </w:p>
+    <w:tbl xmlns:ns4="urn:orca:p1b-temp">
+      <w:tblPr>
+        <w:tblW w:type="auto" w:w="0"/>
+        <w:tblLook w:firstColumn="1" w:firstRow="1" w:lastColumn="0" w:lastRow="0" w:noHBand="0" w:noVBand="1" w:val="04A0"/>
+        <w:tblBorders>
+          <w:top w:val="single" w:sz="4" w:color="000000"/>
+          <w:left w:val="single" w:sz="4" w:color="000000"/>
+          <w:bottom w:val="single" w:sz="4" w:color="000000"/>
+          <w:right w:val="single" w:sz="4" w:color="000000"/>
+          <w:insideH w:val="single" w:sz="4" w:color="000000"/>
+          <w:insideV w:val="single" w:sz="4" w:color="000000"/>
+        </w:tblBorders>
+      </w:tblPr>
+      <w:tblGrid>
+        <w:gridCol w:w="2160"/>
+        <w:gridCol w:w="2160"/>
+        <w:gridCol w:w="2160"/>
+        <w:gridCol w:w="2160"/>
+      </w:tblGrid>
+      <w:tr>
+        <w:tc>
+          <w:tcPr>
+            <w:tcW w:type="dxa" w:w="2160"/>
+          </w:tcPr>
+          <w:p>
+            <w:r>
+              <w:rPr>
+                <w:b/>
+              </w:rPr>
+              <w:t>Loại cổ phần</w:t>
+            </w:r>
+          </w:p>
+        </w:tc>
+        <w:tc>
+          <w:tcPr>
+            <w:tcW w:type="dxa" w:w="2160"/>
+          </w:tcPr>
+          <w:p>
+            <w:r>
+              <w:rPr>
+                <w:b/>
+              </w:rPr>
+              <w:t>Số lượng</w:t>
+            </w:r>
+          </w:p>
+        </w:tc>
+        <w:tc>
+          <w:tcPr>
+            <w:tcW w:type="dxa" w:w="2160"/>
+          </w:tcPr>
+          <w:p>
+            <w:r>
+              <w:rPr>
+                <w:b/>
+              </w:rPr>
+              <w:t>Giá trị (bằng số, VNĐ)</w:t>
+            </w:r>
+          </w:p>
+        </w:tc>
+        <w:tc>
+          <w:tcPr>
+            <w:tcW w:type="dxa" w:w="2160"/>
+          </w:tcPr>
+          <w:p>
+            <w:r>
+              <w:rPr>
+                <w:b/>
+              </w:rPr>
+              <w:t>Tỉ lệ so với vốn điều lệ (%)</w:t>
+            </w:r>
+          </w:p>
+        </w:tc>
+      </w:tr>
+      <w:tr>
+        <w:tc>
+          <w:tcPr>
+            <w:tcW w:type="dxa" w:w="2160"/>
+          </w:tcPr>
+          <w:p>
+            <w:r>
+              <w:rPr>
+                <w:b w:val="0"/>
+              </w:rPr>
+              <w:t>Cổ phần phổ thông</w:t>
+            </w:r>
+          </w:p>
+        </w:tc>
+        <w:tc>
+          <w:tcPr>
+            <w:tcW w:type="dxa" w:w="2160"/>
+          </w:tcPr>
+          <w:p>
+            <w:r>
+              <w:rPr>
+                <w:b w:val="0"/>
+              </w:rPr>
+              <w:t>{co_cau_loai_co_phan_sau_thay_doi.co_phan_pho_thong.so_luong}</w:t>
+            </w:r>
+          </w:p>
+        </w:tc>
+        <w:tc>
+          <w:tcPr>
+            <w:tcW w:type="dxa" w:w="2160"/>
+          </w:tcPr>
+          <w:p>
+            <w:r>
+              <w:rPr>
+                <w:b w:val="0"/>
+              </w:rPr>
+              <w:t>{co_cau_loai_co_phan_sau_thay_doi.co_phan_pho_thong.gia_tri_vnd}</w:t>
+            </w:r>
+          </w:p>
+        </w:tc>
+        <w:tc>
+          <w:tcPr>
+            <w:tcW w:type="dxa" w:w="2160"/>
+          </w:tcPr>
+          <w:p>
+            <w:r>
+              <w:rPr>
+                <w:b w:val="0"/>
+              </w:rPr>
+              <w:t>{co_cau_loai_co_phan_sau_thay_doi.co_phan_pho_thong.ty_le_so_von_dieule}</w:t>
+            </w:r>
+          </w:p>
+        </w:tc>
+      </w:tr>
+      <w:tr>
+        <w:tc>
+          <w:tcPr>
+            <w:tcW w:type="dxa" w:w="2160"/>
+          </w:tcPr>
+          <w:p>
+            <w:r>
+              <w:rPr>
+                <w:b w:val="0"/>
+              </w:rPr>
+              <w:t>Cổ phần ưu đã biểu quyết</w:t>
+            </w:r>
+          </w:p>
+        </w:tc>
+        <w:tc>
+          <w:tcPr>
+            <w:tcW w:type="dxa" w:w="2160"/>
+          </w:tcPr>
+          <w:p>
+            <w:r>
+              <w:rPr>
+                <w:b w:val="0"/>
+              </w:rPr>
+              <w:t>{co_cau_loai_co_phan_sau_thay_doi.cp_uu_dai_bieu_quyet.so_luong}</w:t>
+            </w:r>
+          </w:p>
+        </w:tc>
+        <w:tc>
+          <w:tcPr>
+            <w:tcW w:type="dxa" w:w="2160"/>
+          </w:tcPr>
+          <w:p>
+            <w:r>
+              <w:rPr>
+                <w:b w:val="0"/>
+              </w:rPr>
+              <w:t>{co_cau_loai_co_phan_sau_thay_doi.cp_uu_dai_bieu_quyet.gia_tri_vnd}</w:t>
+            </w:r>
+          </w:p>
+        </w:tc>
+        <w:tc>
+          <w:tcPr>
+            <w:tcW w:type="dxa" w:w="2160"/>
+          </w:tcPr>
+          <w:p>
+            <w:r>
+              <w:rPr>
+                <w:b w:val="0"/>
+              </w:rPr>
+              <w:t>{co_cau_loai_co_phan_sau_thay_doi.cp_uu_dai_bieu_quyet.ty_le_so_von_dieule}</w:t>
+            </w:r>
+          </w:p>
+        </w:tc>
+      </w:tr>
+      <w:tr>
+        <w:tc>
+          <w:tcPr>
+            <w:tcW w:type="dxa" w:w="2160"/>
+          </w:tcPr>
+          <w:p>
+            <w:r>
+              <w:rPr>
+                <w:b w:val="0"/>
+              </w:rPr>
+              <w:t>Cổ phần ưu đãi cổ tức</w:t>
+            </w:r>
+          </w:p>
+        </w:tc>
+        <w:tc>
+          <w:tcPr>
+            <w:tcW w:type="dxa" w:w="2160"/>
+          </w:tcPr>
+          <w:p>
+            <w:r>
+              <w:rPr>
+                <w:b w:val="0"/>
+              </w:rPr>
+              <w:t>{co_cau_loai_co_phan_sau_thay_doi.cp_uu_dai_co_tuc.so_luong}</w:t>
+            </w:r>
+          </w:p>
+        </w:tc>
+        <w:tc>
+          <w:tcPr>
+            <w:tcW w:type="dxa" w:w="2160"/>
+          </w:tcPr>
+          <w:p>
+            <w:r>
+              <w:rPr>
+                <w:b w:val="0"/>
+              </w:rPr>
+              <w:t>{co_cau_loai_co_phan_sau_thay_doi.cp_uu_dai_co_tuc.gia_tri_vnd}</w:t>
+            </w:r>
+          </w:p>
+        </w:tc>
+        <w:tc>
+          <w:tcPr>
+            <w:tcW w:type="dxa" w:w="2160"/>
+          </w:tcPr>
+          <w:p>
+            <w:r>
+              <w:rPr>
+                <w:b w:val="0"/>
+              </w:rPr>
+              <w:t>{co_cau_loai_co_phan_sau_thay_doi.cp_uu_dai_co_tuc.ty_le_so_von_dieule}</w:t>
+            </w:r>
+          </w:p>
+        </w:tc>
+      </w:tr>
+      <w:tr>
+        <w:tc>
+          <w:tcPr>
+            <w:tcW w:type="dxa" w:w="2160"/>
+          </w:tcPr>
+          <w:p>
+            <w:r>
+              <w:rPr>
+                <w:b w:val="0"/>
+              </w:rPr>
+              <w:t>Cổ phần ưu đãi hoàn lại</w:t>
+            </w:r>
+          </w:p>
+        </w:tc>
+        <w:tc>
+          <w:tcPr>
+            <w:tcW w:type="dxa" w:w="2160"/>
+          </w:tcPr>
+          <w:p>
+            <w:r>
+              <w:rPr>
+                <w:b w:val="0"/>
+              </w:rPr>
+              <w:t>{co_cau_loai_co_phan_sau_thay_doi.cp_uu_dai_hoan_lai.so_luong}</w:t>
+            </w:r>
+          </w:p>
+        </w:tc>
+        <w:tc>
+          <w:tcPr>
+            <w:tcW w:type="dxa" w:w="2160"/>
+          </w:tcPr>
+          <w:p>
+            <w:r>
+              <w:rPr>
+                <w:b w:val="0"/>
+              </w:rPr>
+              <w:t>{co_cau_loai_co_phan_sau_thay_doi.cp_uu_dai_hoan_lai.gia_tri_vnd}</w:t>
+            </w:r>
+          </w:p>
+        </w:tc>
+        <w:tc>
+          <w:tcPr>
+            <w:tcW w:type="dxa" w:w="2160"/>
+          </w:tcPr>
+          <w:p>
+            <w:r>
+              <w:rPr>
+                <w:b w:val="0"/>
+              </w:rPr>
+              <w:t>{co_cau_loai_co_phan_sau_thay_doi.cp_uu_dai_hoan_lai.ty_le_so_von_dieule}</w:t>
+            </w:r>
+          </w:p>
+        </w:tc>
+      </w:tr>
+      <w:tr>
+        <w:tc>
+          <w:tcPr>
+            <w:tcW w:type="dxa" w:w="2160"/>
+          </w:tcPr>
+          <w:p>
+            <w:r>
+              <w:rPr>
+                <w:b w:val="0"/>
+              </w:rPr>
+              <w:t>Các cổ phần ưu đãi khác</w:t>
+            </w:r>
+          </w:p>
+        </w:tc>
+        <w:tc>
+          <w:tcPr>
+            <w:tcW w:type="dxa" w:w="2160"/>
+          </w:tcPr>
+          <w:p>
+            <w:r>
+              <w:rPr>
+                <w:b w:val="0"/>
+              </w:rPr>
+              <w:t>{co_cau_loai_co_phan_sau_thay_doi.cp_uu_dai_khac.so_luong}</w:t>
+            </w:r>
+          </w:p>
+        </w:tc>
+        <w:tc>
+          <w:tcPr>
+            <w:tcW w:type="dxa" w:w="2160"/>
+          </w:tcPr>
+          <w:p>
+            <w:r>
+              <w:rPr>
+                <w:b w:val="0"/>
+              </w:rPr>
+              <w:t>{co_cau_loai_co_phan_sau_thay_doi.cp_uu_dai_khac.gia_tri_vnd}</w:t>
+            </w:r>
+          </w:p>
+        </w:tc>
+        <w:tc>
+          <w:tcPr>
+            <w:tcW w:type="dxa" w:w="2160"/>
+          </w:tcPr>
+          <w:p>
+            <w:r>
+              <w:rPr>
+                <w:b w:val="0"/>
+              </w:rPr>
+              <w:t>{co_cau_loai_co_phan_sau_thay_doi.cp_uu_dai_khac.ty_le_so_von_dieule}</w:t>
+            </w:r>
+          </w:p>
+        </w:tc>
+      </w:tr>
+      <w:tr>
+        <w:tc>
+          <w:tcPr>
+            <w:tcW w:type="dxa" w:w="2160"/>
+          </w:tcPr>
+          <w:p>
+            <w:r>
+              <w:rPr>
+                <w:b w:val="0"/>
+              </w:rPr>
+              <w:t>Tổng số</w:t>
+            </w:r>
+          </w:p>
+        </w:tc>
+        <w:tc>
+          <w:tcPr>
+            <w:tcW w:type="dxa" w:w="2160"/>
+          </w:tcPr>
+          <w:p>
+            <w:r>
+              <w:rPr>
+                <w:b w:val="0"/>
+              </w:rPr>
+              <w:t>{co_cau_loai_co_phan_sau_thay_doi.tong_so.so_luong}</w:t>
+            </w:r>
+          </w:p>
+        </w:tc>
+        <w:tc>
+          <w:tcPr>
+            <w:tcW w:type="dxa" w:w="2160"/>
+          </w:tcPr>
+          <w:p>
+            <w:r>
+              <w:rPr>
+                <w:b w:val="0"/>
+              </w:rPr>
+              <w:t>{co_cau_loai_co_phan_sau_thay_doi.tong_so.gia_tri_vnd}</w:t>
+            </w:r>
+          </w:p>
+        </w:tc>
+        <w:tc>
+          <w:tcPr>
+            <w:tcW w:type="dxa" w:w="2160"/>
+          </w:tcPr>
+          <w:p>
+            <w:r>
+              <w:rPr>
+                <w:b w:val="0"/>
+              </w:rPr>
+              <w:t>{co_cau_loai_co_phan_sau_thay_doi.tong_so.ty_le_so_von_dieule}</w:t>
+            </w:r>
+          </w:p>
+        </w:tc>
+      </w:tr>
+    </w:tbl>
+    <w:p/>
+    <w:p>
+      <w:pPr>
+        <w:spacing w:before="120"/>
+      </w:pPr>
+      <w:r>
+        <w:rPr>
+          <w:rFonts w:ascii="Arial" w:hAnsi="Arial" w:cs="Arial"/>
+          <w:sz w:val="24"/>
+          <w:sz-cs w:val="24"/>
+        </w:rPr>
+        <w:t>Mệnh giá cổ phần: {menh_gia_co_phan}</w:t>
+      </w:r>
+    </w:p>
     <w:p>
       <w:pPr>
         <w:jc w:val="center"/>
@@ -1794,8 +2871,9 @@
           <w:rFonts w:ascii="Arial" w:hAnsi="Arial" w:cs="Arial"/>
           <w:sz w:val="24"/>
           <w:sz-cs w:val="24"/>
-        </w:rPr>
-        <w:t xml:space="preserve">Tài sản góp vốn</w:t>
+          <w:b/>
+        </w:rPr>
+        <w:t xml:space="preserve"/>
       </w:r>
     </w:p>
     <w:p>
@@ -1808,42 +2886,9 @@
           <w:rFonts w:ascii="Arial" w:hAnsi="Arial" w:cs="Arial"/>
           <w:sz w:val="24"/>
           <w:sz-cs w:val="24"/>
-        </w:rPr>
-        <w:t xml:space="preserve">Giá trị vốn của từng tài sản trong vốn điều lệ</w:t>
-      </w:r>
-      <w:r>
-        <w:rPr>
-          <w:rFonts w:ascii="Arial" w:hAnsi="Arial" w:cs="Arial"/>
-          <w:sz w:val="24"/>
-          <w:sz-cs w:val="24"/>
-          <w:i/>
-        </w:rPr>
-        <w:t xml:space="preserve"> </w:t>
-      </w:r>
-      <w:r>
-        <w:rPr>
-          <w:rFonts w:ascii="Arial" w:hAnsi="Arial" w:cs="Arial"/>
-          <w:sz w:val="24"/>
-          <w:sz-cs w:val="24"/>
-        </w:rPr>
-        <w:t xml:space="preserve">(</w:t>
-      </w:r>
-      <w:r>
-        <w:rPr>
-          <w:rFonts w:ascii="Arial" w:hAnsi="Arial" w:cs="Arial"/>
-          <w:sz w:val="24"/>
-          <w:sz-cs w:val="24"/>
-          <w:i/>
-        </w:rPr>
-        <w:t xml:space="preserve">bằng số, VNĐ</w:t>
-      </w:r>
-      <w:r>
-        <w:rPr>
-          <w:rFonts w:ascii="Arial" w:hAnsi="Arial" w:cs="Arial"/>
-          <w:sz w:val="24"/>
-          <w:sz-cs w:val="24"/>
-        </w:rPr>
-        <w:t xml:space="preserve">)</w:t>
+          <w:b/>
+        </w:rPr>
+        <w:t xml:space="preserve"/>
       </w:r>
     </w:p>
     <w:p>
@@ -1856,25 +2901,9 @@
           <w:rFonts w:ascii="Arial" w:hAnsi="Arial" w:cs="Arial"/>
           <w:sz w:val="24"/>
           <w:sz-cs w:val="24"/>
-        </w:rPr>
-        <w:t xml:space="preserve">Tỷ lệ (</w:t>
-      </w:r>
-      <w:r>
-        <w:rPr>
-          <w:rFonts w:ascii="Arial" w:hAnsi="Arial" w:cs="Arial"/>
-          <w:sz w:val="24"/>
-          <w:sz-cs w:val="24"/>
-          <w:i/>
-        </w:rPr>
-        <w:t xml:space="preserve">%</w:t>
-      </w:r>
-      <w:r>
-        <w:rPr>
-          <w:rFonts w:ascii="Arial" w:hAnsi="Arial" w:cs="Arial"/>
-          <w:sz w:val="24"/>
-          <w:sz-cs w:val="24"/>
-        </w:rPr>
-        <w:t xml:space="preserve">)</w:t>
+          <w:b/>
+        </w:rPr>
+        <w:t xml:space="preserve"/>
       </w:r>
     </w:p>
     <w:p>
@@ -1887,45 +2916,7 @@
           <w:rFonts w:ascii="Arial" w:hAnsi="Arial" w:cs="Arial"/>
           <w:sz w:val="24"/>
           <w:sz-cs w:val="24"/>
-        </w:rPr>
-        <w:t xml:space="preserve">1</w:t>
-      </w:r>
-    </w:p>
-    <w:p>
-      <w:pPr>
-        <w:spacing w:before="120"/>
-      </w:pPr>
-      <w:r>
-        <w:rPr>
-          <w:rFonts w:ascii="Arial" w:hAnsi="Arial" w:cs="Arial"/>
-          <w:sz w:val="24"/>
-          <w:sz-cs w:val="24"/>
-        </w:rPr>
-        <w:t xml:space="preserve">Đồng Việt Nam</w:t>
-      </w:r>
-    </w:p>
-    <w:p>
-      <w:pPr>
-        <w:spacing w:before="120"/>
-      </w:pPr>
-      <w:r>
-        <w:rPr>
-          <w:rFonts w:ascii="Arial" w:hAnsi="Arial" w:cs="Arial"/>
-          <w:sz w:val="24"/>
-          <w:sz-cs w:val="24"/>
-        </w:rPr>
-        <w:t xml:space="preserve"/>
-      </w:r>
-    </w:p>
-    <w:p>
-      <w:pPr>
-        <w:spacing w:before="120"/>
-      </w:pPr>
-      <w:r>
-        <w:rPr>
-          <w:rFonts w:ascii="Arial" w:hAnsi="Arial" w:cs="Arial"/>
-          <w:sz w:val="24"/>
-          <w:sz-cs w:val="24"/>
+          <w:b/>
         </w:rPr>
         <w:t xml:space="preserve"/>
       </w:r>
@@ -1940,62 +2931,7 @@
           <w:rFonts w:ascii="Arial" w:hAnsi="Arial" w:cs="Arial"/>
           <w:sz w:val="24"/>
           <w:sz-cs w:val="24"/>
-        </w:rPr>
-        <w:t xml:space="preserve">2</w:t>
-      </w:r>
-    </w:p>
-    <w:p>
-      <w:pPr>
-        <w:spacing w:before="120"/>
-      </w:pPr>
-      <w:r>
-        <w:rPr>
-          <w:rFonts w:ascii="Arial" w:hAnsi="Arial" w:cs="Arial"/>
-          <w:sz w:val="24"/>
-          <w:sz-cs w:val="24"/>
-        </w:rPr>
-        <w:t xml:space="preserve">Ngoại tệ tự do chuyển đổi (</w:t>
-      </w:r>
-      <w:r>
-        <w:rPr>
-          <w:rFonts w:ascii="Arial" w:hAnsi="Arial" w:cs="Arial"/>
-          <w:sz w:val="24"/>
-          <w:sz-cs w:val="24"/>
-          <w:i/>
-        </w:rPr>
-        <w:t xml:space="preserve">ghi rõ loại ngoại tệ, số tiền được góp bằng mỗi loại ngoại tệ</w:t>
-      </w:r>
-      <w:r>
-        <w:rPr>
-          <w:rFonts w:ascii="Arial" w:hAnsi="Arial" w:cs="Arial"/>
-          <w:sz w:val="24"/>
-          <w:sz-cs w:val="24"/>
-        </w:rPr>
-        <w:t xml:space="preserve">)</w:t>
-      </w:r>
-    </w:p>
-    <w:p>
-      <w:pPr>
-        <w:spacing w:before="120"/>
-      </w:pPr>
-      <w:r>
-        <w:rPr>
-          <w:rFonts w:ascii="Arial" w:hAnsi="Arial" w:cs="Arial"/>
-          <w:sz w:val="24"/>
-          <w:sz-cs w:val="24"/>
-        </w:rPr>
-        <w:t xml:space="preserve"/>
-      </w:r>
-    </w:p>
-    <w:p>
-      <w:pPr>
-        <w:spacing w:before="120"/>
-      </w:pPr>
-      <w:r>
-        <w:rPr>
-          <w:rFonts w:ascii="Arial" w:hAnsi="Arial" w:cs="Arial"/>
-          <w:sz w:val="24"/>
-          <w:sz-cs w:val="24"/>
+          <w:b/>
         </w:rPr>
         <w:t xml:space="preserve"/>
       </w:r>
@@ -2010,47 +2946,22 @@
           <w:rFonts w:ascii="Arial" w:hAnsi="Arial" w:cs="Arial"/>
           <w:sz w:val="24"/>
           <w:sz-cs w:val="24"/>
-        </w:rPr>
-        <w:t xml:space="preserve">3</w:t>
-      </w:r>
-    </w:p>
-    <w:p>
-      <w:pPr>
-        <w:spacing w:before="120"/>
-      </w:pPr>
-      <w:r>
-        <w:rPr>
-          <w:rFonts w:ascii="Arial" w:hAnsi="Arial" w:cs="Arial"/>
-          <w:sz w:val="24"/>
-          <w:sz-cs w:val="24"/>
-        </w:rPr>
-        <w:t xml:space="preserve">Vàng</w:t>
-      </w:r>
-    </w:p>
-    <w:p>
-      <w:pPr>
-        <w:spacing w:before="120"/>
-      </w:pPr>
-      <w:r>
-        <w:rPr>
-          <w:rFonts w:ascii="Arial" w:hAnsi="Arial" w:cs="Arial"/>
-          <w:sz w:val="24"/>
-          <w:sz-cs w:val="24"/>
-        </w:rPr>
-        <w:t xml:space="preserve"/>
-      </w:r>
-    </w:p>
-    <w:p>
-      <w:pPr>
-        <w:spacing w:before="120"/>
-      </w:pPr>
-      <w:r>
-        <w:rPr>
-          <w:rFonts w:ascii="Arial" w:hAnsi="Arial" w:cs="Arial"/>
-          <w:sz w:val="24"/>
-          <w:sz-cs w:val="24"/>
-        </w:rPr>
-        <w:t xml:space="preserve"/>
+          <w:b/>
+        </w:rPr>
+        <w:t xml:space="preserve"/>
+      </w:r>
+    </w:p>
+    <w:p>
+      <w:pPr>
+        <w:spacing w:before="120"/>
+      </w:pPr>
+      <w:r>
+        <w:rPr>
+          <w:rFonts w:ascii="Arial" w:hAnsi="Arial" w:cs="Arial"/>
+          <w:sz w:val="24"/>
+          <w:sz-cs w:val="24"/>
+        </w:rPr>
+        <w:t xml:space="preserve">Cổ phần ưu đã cổ tức</w:t>
       </w:r>
     </w:p>
     <w:p>
@@ -2063,45 +2974,7 @@
           <w:rFonts w:ascii="Arial" w:hAnsi="Arial" w:cs="Arial"/>
           <w:sz w:val="24"/>
           <w:sz-cs w:val="24"/>
-        </w:rPr>
-        <w:t xml:space="preserve">4</w:t>
-      </w:r>
-    </w:p>
-    <w:p>
-      <w:pPr>
-        <w:spacing w:before="120"/>
-      </w:pPr>
-      <w:r>
-        <w:rPr>
-          <w:rFonts w:ascii="Arial" w:hAnsi="Arial" w:cs="Arial"/>
-          <w:sz w:val="24"/>
-          <w:sz-cs w:val="24"/>
-        </w:rPr>
-        <w:t xml:space="preserve">Quyền sử dụng đất</w:t>
-      </w:r>
-    </w:p>
-    <w:p>
-      <w:pPr>
-        <w:spacing w:before="120"/>
-      </w:pPr>
-      <w:r>
-        <w:rPr>
-          <w:rFonts w:ascii="Arial" w:hAnsi="Arial" w:cs="Arial"/>
-          <w:sz w:val="24"/>
-          <w:sz-cs w:val="24"/>
-        </w:rPr>
-        <w:t xml:space="preserve"/>
-      </w:r>
-    </w:p>
-    <w:p>
-      <w:pPr>
-        <w:spacing w:before="120"/>
-      </w:pPr>
-      <w:r>
-        <w:rPr>
-          <w:rFonts w:ascii="Arial" w:hAnsi="Arial" w:cs="Arial"/>
-          <w:sz w:val="24"/>
-          <w:sz-cs w:val="24"/>
+          <w:b/>
         </w:rPr>
         <w:t xml:space="preserve"/>
       </w:r>
@@ -2116,45 +2989,7 @@
           <w:rFonts w:ascii="Arial" w:hAnsi="Arial" w:cs="Arial"/>
           <w:sz w:val="24"/>
           <w:sz-cs w:val="24"/>
-        </w:rPr>
-        <w:t xml:space="preserve">5</w:t>
-      </w:r>
-    </w:p>
-    <w:p>
-      <w:pPr>
-        <w:spacing w:before="120"/>
-      </w:pPr>
-      <w:r>
-        <w:rPr>
-          <w:rFonts w:ascii="Arial" w:hAnsi="Arial" w:cs="Arial"/>
-          <w:sz w:val="24"/>
-          <w:sz-cs w:val="24"/>
-        </w:rPr>
-        <w:t xml:space="preserve">Quyền sở hữu trí tuệ</w:t>
-      </w:r>
-    </w:p>
-    <w:p>
-      <w:pPr>
-        <w:spacing w:before="120"/>
-      </w:pPr>
-      <w:r>
-        <w:rPr>
-          <w:rFonts w:ascii="Arial" w:hAnsi="Arial" w:cs="Arial"/>
-          <w:sz w:val="24"/>
-          <w:sz-cs w:val="24"/>
-        </w:rPr>
-        <w:t xml:space="preserve"/>
-      </w:r>
-    </w:p>
-    <w:p>
-      <w:pPr>
-        <w:spacing w:before="120"/>
-      </w:pPr>
-      <w:r>
-        <w:rPr>
-          <w:rFonts w:ascii="Arial" w:hAnsi="Arial" w:cs="Arial"/>
-          <w:sz w:val="24"/>
-          <w:sz-cs w:val="24"/>
+          <w:b/>
         </w:rPr>
         <w:t xml:space="preserve"/>
       </w:r>
@@ -2169,62 +3004,7 @@
           <w:rFonts w:ascii="Arial" w:hAnsi="Arial" w:cs="Arial"/>
           <w:sz w:val="24"/>
           <w:sz-cs w:val="24"/>
-        </w:rPr>
-        <w:t xml:space="preserve">6</w:t>
-      </w:r>
-    </w:p>
-    <w:p>
-      <w:pPr>
-        <w:spacing w:before="120"/>
-      </w:pPr>
-      <w:r>
-        <w:rPr>
-          <w:rFonts w:ascii="Arial" w:hAnsi="Arial" w:cs="Arial"/>
-          <w:sz w:val="24"/>
-          <w:sz-cs w:val="24"/>
-        </w:rPr>
-        <w:t xml:space="preserve">Các tài sản khác (</w:t>
-      </w:r>
-      <w:r>
-        <w:rPr>
-          <w:rFonts w:ascii="Arial" w:hAnsi="Arial" w:cs="Arial"/>
-          <w:sz w:val="24"/>
-          <w:sz-cs w:val="24"/>
-          <w:i/>
-        </w:rPr>
-        <w:t xml:space="preserve">ghi rõ loại tài sản, số lượng và giá trị còn lại của mỗi loại tài sản, có thể lập thành danh mục riêng kèm theo hồ sơ đăng ký doanh nghiệp</w:t>
-      </w:r>
-      <w:r>
-        <w:rPr>
-          <w:rFonts w:ascii="Arial" w:hAnsi="Arial" w:cs="Arial"/>
-          <w:sz w:val="24"/>
-          <w:sz-cs w:val="24"/>
-        </w:rPr>
-        <w:t xml:space="preserve">)</w:t>
-      </w:r>
-    </w:p>
-    <w:p>
-      <w:pPr>
-        <w:spacing w:before="120"/>
-      </w:pPr>
-      <w:r>
-        <w:rPr>
-          <w:rFonts w:ascii="Arial" w:hAnsi="Arial" w:cs="Arial"/>
-          <w:sz w:val="24"/>
-          <w:sz-cs w:val="24"/>
-        </w:rPr>
-        <w:t xml:space="preserve"/>
-      </w:r>
-    </w:p>
-    <w:p>
-      <w:pPr>
-        <w:spacing w:before="120"/>
-      </w:pPr>
-      <w:r>
-        <w:rPr>
-          <w:rFonts w:ascii="Arial" w:hAnsi="Arial" w:cs="Arial"/>
-          <w:sz w:val="24"/>
-          <w:sz-cs w:val="24"/>
+          <w:b/>
         </w:rPr>
         <w:t xml:space="preserve"/>
       </w:r>
@@ -2239,77 +3019,9 @@
           <w:rFonts w:ascii="Arial" w:hAnsi="Arial" w:cs="Arial"/>
           <w:sz w:val="24"/>
           <w:sz-cs w:val="24"/>
-        </w:rPr>
-        <w:t xml:space="preserve">Tổng số</w:t>
-      </w:r>
-    </w:p>
-    <w:p>
-      <w:pPr>
-        <w:spacing w:before="120"/>
-      </w:pPr>
-      <w:r>
-        <w:rPr>
-          <w:rFonts w:ascii="Arial" w:hAnsi="Arial" w:cs="Arial"/>
-          <w:sz w:val="24"/>
-          <w:sz-cs w:val="24"/>
-        </w:rPr>
-        <w:t xml:space="preserve"/>
-      </w:r>
-    </w:p>
-    <w:p>
-      <w:pPr>
-        <w:spacing w:before="120"/>
-      </w:pPr>
-      <w:r>
-        <w:rPr>
-          <w:rFonts w:ascii="Arial" w:hAnsi="Arial" w:cs="Arial"/>
-          <w:sz w:val="24"/>
-          <w:sz-cs w:val="24"/>
-        </w:rPr>
-        <w:t xml:space="preserve"/>
-      </w:r>
-    </w:p>
-    <w:p>
-      <w:pPr>
-        <w:spacing w:before="120"/>
-      </w:pPr>
-      <w:r>
-        <w:rPr>
-          <w:rFonts w:ascii="Arial" w:hAnsi="Arial" w:cs="Arial"/>
-          <w:sz w:val="24"/>
-          <w:sz-cs w:val="24"/>
-        </w:rPr>
-        <w:t xml:space="preserve">Thông tin về cổ phần (</w:t>
-      </w:r>
-      <w:r>
-        <w:rPr>
-          <w:rFonts w:ascii="Arial" w:hAnsi="Arial" w:cs="Arial"/>
-          <w:sz w:val="24"/>
-          <w:sz-cs w:val="24"/>
-          <w:i/>
-        </w:rPr>
-        <w:t xml:space="preserve">chỉ kê khai đối với công ty cổ phần</w:t>
-      </w:r>
-      <w:r>
-        <w:rPr>
-          <w:rFonts w:ascii="Arial" w:hAnsi="Arial" w:cs="Arial"/>
-          <w:sz w:val="24"/>
-          <w:sz-cs w:val="24"/>
-        </w:rPr>
-        <w:t xml:space="preserve">):</w:t>
-      </w:r>
-    </w:p>
-    <w:p>
-      <w:pPr>
-        <w:spacing w:before="120"/>
-      </w:pPr>
-      <w:r>
-        <w:rPr>
-          <w:rFonts w:ascii="Arial" w:hAnsi="Arial" w:cs="Arial"/>
-          <w:sz w:val="24"/>
-          <w:sz-cs w:val="24"/>
-        </w:rPr>
-        <w:t>Mệnh giá cổ phần: {menh_gia_co_phan}</w:t>
+          <w:b/>
+        </w:rPr>
+        <w:t xml:space="preserve"/>
       </w:r>
     </w:p>
     <w:p>
@@ -2322,8 +3034,9 @@
           <w:rFonts w:ascii="Arial" w:hAnsi="Arial" w:cs="Arial"/>
           <w:sz w:val="24"/>
           <w:sz-cs w:val="24"/>
-        </w:rPr>
-        <w:t xml:space="preserve">Loại cổ phần</w:t>
+          <w:b/>
+        </w:rPr>
+        <w:t xml:space="preserve"/>
       </w:r>
     </w:p>
     <w:p>
@@ -2336,8 +3049,9 @@
           <w:rFonts w:ascii="Arial" w:hAnsi="Arial" w:cs="Arial"/>
           <w:sz w:val="24"/>
           <w:sz-cs w:val="24"/>
-        </w:rPr>
-        <w:t xml:space="preserve">Số lượng</w:t>
+          <w:b/>
+        </w:rPr>
+        <w:t xml:space="preserve"/>
       </w:r>
     </w:p>
     <w:p>
@@ -2350,25 +3064,9 @@
           <w:rFonts w:ascii="Arial" w:hAnsi="Arial" w:cs="Arial"/>
           <w:sz w:val="24"/>
           <w:sz-cs w:val="24"/>
-        </w:rPr>
-        <w:t xml:space="preserve">Giá trị (</w:t>
-      </w:r>
-      <w:r>
-        <w:rPr>
-          <w:rFonts w:ascii="Arial" w:hAnsi="Arial" w:cs="Arial"/>
-          <w:sz w:val="24"/>
-          <w:sz-cs w:val="24"/>
-          <w:i/>
-        </w:rPr>
-        <w:t xml:space="preserve">bằng số, VNĐ</w:t>
-      </w:r>
-      <w:r>
-        <w:rPr>
-          <w:rFonts w:ascii="Arial" w:hAnsi="Arial" w:cs="Arial"/>
-          <w:sz w:val="24"/>
-          <w:sz-cs w:val="24"/>
-        </w:rPr>
-        <w:t xml:space="preserve">)</w:t>
+          <w:b/>
+        </w:rPr>
+        <w:t xml:space="preserve"/>
       </w:r>
     </w:p>
     <w:p>
@@ -2381,25 +3079,9 @@
           <w:rFonts w:ascii="Arial" w:hAnsi="Arial" w:cs="Arial"/>
           <w:sz w:val="24"/>
           <w:sz-cs w:val="24"/>
-        </w:rPr>
-        <w:t xml:space="preserve">Tỉ lệ so với vốn điều lệ (</w:t>
-      </w:r>
-      <w:r>
-        <w:rPr>
-          <w:rFonts w:ascii="Arial" w:hAnsi="Arial" w:cs="Arial"/>
-          <w:sz w:val="24"/>
-          <w:sz-cs w:val="24"/>
-          <w:i/>
-        </w:rPr>
-        <w:t xml:space="preserve">%</w:t>
-      </w:r>
-      <w:r>
-        <w:rPr>
-          <w:rFonts w:ascii="Arial" w:hAnsi="Arial" w:cs="Arial"/>
-          <w:sz w:val="24"/>
-          <w:sz-cs w:val="24"/>
-        </w:rPr>
-        <w:t xml:space="preserve">)</w:t>
+          <w:b/>
+        </w:rPr>
+        <w:t xml:space="preserve"/>
       </w:r>
     </w:p>
     <w:p>
@@ -2412,367 +3094,9 @@
           <w:rFonts w:ascii="Arial" w:hAnsi="Arial" w:cs="Arial"/>
           <w:sz w:val="24"/>
           <w:sz-cs w:val="24"/>
-        </w:rPr>
-        <w:t xml:space="preserve">1</w:t>
-      </w:r>
-    </w:p>
-    <w:p>
-      <w:pPr>
-        <w:spacing w:before="120"/>
-      </w:pPr>
-      <w:r>
-        <w:rPr>
-          <w:rFonts w:ascii="Arial" w:hAnsi="Arial" w:cs="Arial"/>
-          <w:sz w:val="24"/>
-          <w:sz-cs w:val="24"/>
-        </w:rPr>
-        <w:t xml:space="preserve">Cổ phần phổ thông</w:t>
-      </w:r>
-    </w:p>
-    <w:p>
-      <w:pPr>
-        <w:jc w:val="center"/>
-        <w:spacing w:before="120"/>
-      </w:pPr>
-      <w:r>
-        <w:rPr>
-          <w:rFonts w:ascii="Arial" w:hAnsi="Arial" w:cs="Arial"/>
-          <w:sz w:val="24"/>
-          <w:sz-cs w:val="24"/>
           <w:b/>
         </w:rPr>
         <w:t xml:space="preserve"/>
-      </w:r>
-    </w:p>
-    <w:p>
-      <w:pPr>
-        <w:jc w:val="center"/>
-        <w:spacing w:before="120"/>
-      </w:pPr>
-      <w:r>
-        <w:rPr>
-          <w:rFonts w:ascii="Arial" w:hAnsi="Arial" w:cs="Arial"/>
-          <w:sz w:val="24"/>
-          <w:sz-cs w:val="24"/>
-          <w:b/>
-        </w:rPr>
-        <w:t xml:space="preserve"/>
-      </w:r>
-    </w:p>
-    <w:p>
-      <w:pPr>
-        <w:jc w:val="center"/>
-        <w:spacing w:before="120"/>
-      </w:pPr>
-      <w:r>
-        <w:rPr>
-          <w:rFonts w:ascii="Arial" w:hAnsi="Arial" w:cs="Arial"/>
-          <w:sz w:val="24"/>
-          <w:sz-cs w:val="24"/>
-          <w:b/>
-        </w:rPr>
-        <w:t xml:space="preserve"/>
-      </w:r>
-    </w:p>
-    <w:p>
-      <w:pPr>
-        <w:jc w:val="center"/>
-        <w:spacing w:before="120"/>
-      </w:pPr>
-      <w:r>
-        <w:rPr>
-          <w:rFonts w:ascii="Arial" w:hAnsi="Arial" w:cs="Arial"/>
-          <w:sz w:val="24"/>
-          <w:sz-cs w:val="24"/>
-        </w:rPr>
-        <w:t xml:space="preserve">2</w:t>
-      </w:r>
-    </w:p>
-    <w:p>
-      <w:pPr>
-        <w:spacing w:before="120"/>
-      </w:pPr>
-      <w:r>
-        <w:rPr>
-          <w:rFonts w:ascii="Arial" w:hAnsi="Arial" w:cs="Arial"/>
-          <w:sz w:val="24"/>
-          <w:sz-cs w:val="24"/>
-        </w:rPr>
-        <w:t xml:space="preserve">Cổ phần ưu đã biểu quyết</w:t>
-      </w:r>
-    </w:p>
-    <w:p>
-      <w:pPr>
-        <w:jc w:val="center"/>
-        <w:spacing w:before="120"/>
-      </w:pPr>
-      <w:r>
-        <w:rPr>
-          <w:rFonts w:ascii="Arial" w:hAnsi="Arial" w:cs="Arial"/>
-          <w:sz w:val="24"/>
-          <w:sz-cs w:val="24"/>
-          <w:b/>
-        </w:rPr>
-        <w:t xml:space="preserve"/>
-      </w:r>
-    </w:p>
-    <w:p>
-      <w:pPr>
-        <w:jc w:val="center"/>
-        <w:spacing w:before="120"/>
-      </w:pPr>
-      <w:r>
-        <w:rPr>
-          <w:rFonts w:ascii="Arial" w:hAnsi="Arial" w:cs="Arial"/>
-          <w:sz w:val="24"/>
-          <w:sz-cs w:val="24"/>
-          <w:b/>
-        </w:rPr>
-        <w:t xml:space="preserve"/>
-      </w:r>
-    </w:p>
-    <w:p>
-      <w:pPr>
-        <w:jc w:val="center"/>
-        <w:spacing w:before="120"/>
-      </w:pPr>
-      <w:r>
-        <w:rPr>
-          <w:rFonts w:ascii="Arial" w:hAnsi="Arial" w:cs="Arial"/>
-          <w:sz w:val="24"/>
-          <w:sz-cs w:val="24"/>
-          <w:b/>
-        </w:rPr>
-        <w:t xml:space="preserve"/>
-      </w:r>
-    </w:p>
-    <w:p>
-      <w:pPr>
-        <w:jc w:val="center"/>
-        <w:spacing w:before="120"/>
-      </w:pPr>
-      <w:r>
-        <w:rPr>
-          <w:rFonts w:ascii="Arial" w:hAnsi="Arial" w:cs="Arial"/>
-          <w:sz w:val="24"/>
-          <w:sz-cs w:val="24"/>
-        </w:rPr>
-        <w:t xml:space="preserve">3</w:t>
-      </w:r>
-    </w:p>
-    <w:p>
-      <w:pPr>
-        <w:spacing w:before="120"/>
-      </w:pPr>
-      <w:r>
-        <w:rPr>
-          <w:rFonts w:ascii="Arial" w:hAnsi="Arial" w:cs="Arial"/>
-          <w:sz w:val="24"/>
-          <w:sz-cs w:val="24"/>
-        </w:rPr>
-        <w:t xml:space="preserve">Cổ phần ưu đã cổ tức</w:t>
-      </w:r>
-    </w:p>
-    <w:p>
-      <w:pPr>
-        <w:jc w:val="center"/>
-        <w:spacing w:before="120"/>
-      </w:pPr>
-      <w:r>
-        <w:rPr>
-          <w:rFonts w:ascii="Arial" w:hAnsi="Arial" w:cs="Arial"/>
-          <w:sz w:val="24"/>
-          <w:sz-cs w:val="24"/>
-          <w:b/>
-        </w:rPr>
-        <w:t xml:space="preserve"/>
-      </w:r>
-    </w:p>
-    <w:p>
-      <w:pPr>
-        <w:jc w:val="center"/>
-        <w:spacing w:before="120"/>
-      </w:pPr>
-      <w:r>
-        <w:rPr>
-          <w:rFonts w:ascii="Arial" w:hAnsi="Arial" w:cs="Arial"/>
-          <w:sz w:val="24"/>
-          <w:sz-cs w:val="24"/>
-          <w:b/>
-        </w:rPr>
-        <w:t xml:space="preserve"/>
-      </w:r>
-    </w:p>
-    <w:p>
-      <w:pPr>
-        <w:jc w:val="center"/>
-        <w:spacing w:before="120"/>
-      </w:pPr>
-      <w:r>
-        <w:rPr>
-          <w:rFonts w:ascii="Arial" w:hAnsi="Arial" w:cs="Arial"/>
-          <w:sz w:val="24"/>
-          <w:sz-cs w:val="24"/>
-          <w:b/>
-        </w:rPr>
-        <w:t xml:space="preserve"/>
-      </w:r>
-    </w:p>
-    <w:p>
-      <w:pPr>
-        <w:jc w:val="center"/>
-        <w:spacing w:before="120"/>
-      </w:pPr>
-      <w:r>
-        <w:rPr>
-          <w:rFonts w:ascii="Arial" w:hAnsi="Arial" w:cs="Arial"/>
-          <w:sz w:val="24"/>
-          <w:sz-cs w:val="24"/>
-        </w:rPr>
-        <w:t xml:space="preserve">4</w:t>
-      </w:r>
-    </w:p>
-    <w:p>
-      <w:pPr>
-        <w:spacing w:before="120"/>
-      </w:pPr>
-      <w:r>
-        <w:rPr>
-          <w:rFonts w:ascii="Arial" w:hAnsi="Arial" w:cs="Arial"/>
-          <w:sz w:val="24"/>
-          <w:sz-cs w:val="24"/>
-        </w:rPr>
-        <w:t xml:space="preserve">Cổ phần ưu đãi hoàn lại</w:t>
-      </w:r>
-    </w:p>
-    <w:p>
-      <w:pPr>
-        <w:jc w:val="center"/>
-        <w:spacing w:before="120"/>
-      </w:pPr>
-      <w:r>
-        <w:rPr>
-          <w:rFonts w:ascii="Arial" w:hAnsi="Arial" w:cs="Arial"/>
-          <w:sz w:val="24"/>
-          <w:sz-cs w:val="24"/>
-          <w:b/>
-        </w:rPr>
-        <w:t xml:space="preserve"/>
-      </w:r>
-    </w:p>
-    <w:p>
-      <w:pPr>
-        <w:jc w:val="center"/>
-        <w:spacing w:before="120"/>
-      </w:pPr>
-      <w:r>
-        <w:rPr>
-          <w:rFonts w:ascii="Arial" w:hAnsi="Arial" w:cs="Arial"/>
-          <w:sz w:val="24"/>
-          <w:sz-cs w:val="24"/>
-          <w:b/>
-        </w:rPr>
-        <w:t xml:space="preserve"/>
-      </w:r>
-    </w:p>
-    <w:p>
-      <w:pPr>
-        <w:jc w:val="center"/>
-        <w:spacing w:before="120"/>
-      </w:pPr>
-      <w:r>
-        <w:rPr>
-          <w:rFonts w:ascii="Arial" w:hAnsi="Arial" w:cs="Arial"/>
-          <w:sz w:val="24"/>
-          <w:sz-cs w:val="24"/>
-          <w:b/>
-        </w:rPr>
-        <w:t xml:space="preserve"/>
-      </w:r>
-    </w:p>
-    <w:p>
-      <w:pPr>
-        <w:jc w:val="center"/>
-        <w:spacing w:before="120"/>
-      </w:pPr>
-      <w:r>
-        <w:rPr>
-          <w:rFonts w:ascii="Arial" w:hAnsi="Arial" w:cs="Arial"/>
-          <w:sz w:val="24"/>
-          <w:sz-cs w:val="24"/>
-        </w:rPr>
-        <w:t xml:space="preserve">5</w:t>
-      </w:r>
-    </w:p>
-    <w:p>
-      <w:pPr>
-        <w:spacing w:before="120"/>
-      </w:pPr>
-      <w:r>
-        <w:rPr>
-          <w:rFonts w:ascii="Arial" w:hAnsi="Arial" w:cs="Arial"/>
-          <w:sz w:val="24"/>
-          <w:sz-cs w:val="24"/>
-        </w:rPr>
-        <w:t xml:space="preserve">Các cổ phần ưu đãi khác</w:t>
-      </w:r>
-    </w:p>
-    <w:p>
-      <w:pPr>
-        <w:jc w:val="center"/>
-        <w:spacing w:before="120"/>
-      </w:pPr>
-      <w:r>
-        <w:rPr>
-          <w:rFonts w:ascii="Arial" w:hAnsi="Arial" w:cs="Arial"/>
-          <w:sz w:val="24"/>
-          <w:sz-cs w:val="24"/>
-          <w:b/>
-        </w:rPr>
-        <w:t xml:space="preserve"/>
-      </w:r>
-    </w:p>
-    <w:p>
-      <w:pPr>
-        <w:jc w:val="center"/>
-        <w:spacing w:before="120"/>
-      </w:pPr>
-      <w:r>
-        <w:rPr>
-          <w:rFonts w:ascii="Arial" w:hAnsi="Arial" w:cs="Arial"/>
-          <w:sz w:val="24"/>
-          <w:sz-cs w:val="24"/>
-          <w:b/>
-        </w:rPr>
-        <w:t xml:space="preserve"/>
-      </w:r>
-    </w:p>
-    <w:p>
-      <w:pPr>
-        <w:jc w:val="center"/>
-        <w:spacing w:before="120"/>
-      </w:pPr>
-      <w:r>
-        <w:rPr>
-          <w:rFonts w:ascii="Arial" w:hAnsi="Arial" w:cs="Arial"/>
-          <w:sz w:val="24"/>
-          <w:sz-cs w:val="24"/>
-          <w:b/>
-        </w:rPr>
-        <w:t xml:space="preserve"/>
-      </w:r>
-    </w:p>
-    <w:p>
-      <w:pPr>
-        <w:spacing w:before="120"/>
-      </w:pPr>
-      <w:r>
-        <w:rPr>
-          <w:rFonts w:ascii="Arial" w:hAnsi="Arial" w:cs="Arial"/>
-          <w:sz w:val="24"/>
-          <w:sz-cs w:val="24"/>
-        </w:rPr>
-        <w:t xml:space="preserve">Tổng số</w:t>
       </w:r>
     </w:p>
     <w:p>
@@ -4280,463 +4604,613 @@
         <w:t xml:space="preserve">Tài sản góp vốn sau khi thay đổi vốn đầu tư: </w:t>
       </w:r>
     </w:p>
-    <w:p>
-      <w:pPr>
-        <w:jc w:val="center"/>
-        <w:spacing w:before="120"/>
-      </w:pPr>
-      <w:r>
-        <w:rPr>
-          <w:rFonts w:ascii="Arial" w:hAnsi="Arial" w:cs="Arial"/>
-          <w:sz w:val="24"/>
-          <w:sz-cs w:val="24"/>
-        </w:rPr>
-        <w:t xml:space="preserve">Tài sản góp vốn</w:t>
-      </w:r>
-    </w:p>
-    <w:p>
-      <w:pPr>
-        <w:jc w:val="center"/>
-        <w:spacing w:before="120"/>
-      </w:pPr>
-      <w:r>
-        <w:rPr>
-          <w:rFonts w:ascii="Arial" w:hAnsi="Arial" w:cs="Arial"/>
-          <w:sz w:val="24"/>
-          <w:sz-cs w:val="24"/>
-        </w:rPr>
-        <w:t xml:space="preserve">Giá trị vốn của từng tài sản trong vốn đầu tư</w:t>
-      </w:r>
-      <w:r>
-        <w:rPr>
-          <w:rFonts w:ascii="Arial" w:hAnsi="Arial" w:cs="Arial"/>
-          <w:sz w:val="24"/>
-          <w:sz-cs w:val="24"/>
-          <w:i/>
-        </w:rPr>
-        <w:t xml:space="preserve"> </w:t>
-      </w:r>
-      <w:r>
-        <w:rPr>
-          <w:rFonts w:ascii="Arial" w:hAnsi="Arial" w:cs="Arial"/>
-          <w:sz w:val="24"/>
-          <w:sz-cs w:val="24"/>
-        </w:rPr>
-        <w:t xml:space="preserve">(</w:t>
-      </w:r>
-      <w:r>
-        <w:rPr>
-          <w:rFonts w:ascii="Arial" w:hAnsi="Arial" w:cs="Arial"/>
-          <w:sz w:val="24"/>
-          <w:sz-cs w:val="24"/>
-          <w:i/>
-        </w:rPr>
-        <w:t xml:space="preserve">bằng số, VNĐ</w:t>
-      </w:r>
-      <w:r>
-        <w:rPr>
-          <w:rFonts w:ascii="Arial" w:hAnsi="Arial" w:cs="Arial"/>
-          <w:sz w:val="24"/>
-          <w:sz-cs w:val="24"/>
-        </w:rPr>
-        <w:t xml:space="preserve">)</w:t>
-      </w:r>
-    </w:p>
-    <w:p>
-      <w:pPr>
-        <w:jc w:val="center"/>
-        <w:spacing w:before="120"/>
-      </w:pPr>
-      <w:r>
-        <w:rPr>
-          <w:rFonts w:ascii="Arial" w:hAnsi="Arial" w:cs="Arial"/>
-          <w:sz w:val="24"/>
-          <w:sz-cs w:val="24"/>
-        </w:rPr>
-        <w:t xml:space="preserve">Tỷ lệ (</w:t>
-      </w:r>
-      <w:r>
-        <w:rPr>
-          <w:rFonts w:ascii="Arial" w:hAnsi="Arial" w:cs="Arial"/>
-          <w:sz w:val="24"/>
-          <w:sz-cs w:val="24"/>
-          <w:i/>
-        </w:rPr>
-        <w:t xml:space="preserve">%</w:t>
-      </w:r>
-      <w:r>
-        <w:rPr>
-          <w:rFonts w:ascii="Arial" w:hAnsi="Arial" w:cs="Arial"/>
-          <w:sz w:val="24"/>
-          <w:sz-cs w:val="24"/>
-        </w:rPr>
-        <w:t xml:space="preserve">)</w:t>
-      </w:r>
-    </w:p>
-    <w:p>
-      <w:pPr>
-        <w:jc w:val="center"/>
-        <w:spacing w:before="120"/>
-      </w:pPr>
-      <w:r>
-        <w:rPr>
-          <w:rFonts w:ascii="Arial" w:hAnsi="Arial" w:cs="Arial"/>
-          <w:sz w:val="24"/>
-          <w:sz-cs w:val="24"/>
-        </w:rPr>
-        <w:t xml:space="preserve">1</w:t>
-      </w:r>
-    </w:p>
-    <w:p>
-      <w:pPr>
-        <w:spacing w:before="120"/>
-      </w:pPr>
-      <w:r>
-        <w:rPr>
-          <w:rFonts w:ascii="Arial" w:hAnsi="Arial" w:cs="Arial"/>
-          <w:sz w:val="24"/>
-          <w:sz-cs w:val="24"/>
-        </w:rPr>
-        <w:t xml:space="preserve">Đồng Việt Nam</w:t>
-      </w:r>
-    </w:p>
-    <w:p>
-      <w:pPr>
-        <w:spacing w:before="120"/>
-      </w:pPr>
-      <w:r>
-        <w:rPr>
-          <w:rFonts w:ascii="Arial" w:hAnsi="Arial" w:cs="Arial"/>
-          <w:sz w:val="24"/>
-          <w:sz-cs w:val="24"/>
-        </w:rPr>
-        <w:t xml:space="preserve"/>
-      </w:r>
-    </w:p>
-    <w:p>
-      <w:pPr>
-        <w:spacing w:before="120"/>
-      </w:pPr>
-      <w:r>
-        <w:rPr>
-          <w:rFonts w:ascii="Arial" w:hAnsi="Arial" w:cs="Arial"/>
-          <w:sz w:val="24"/>
-          <w:sz-cs w:val="24"/>
-        </w:rPr>
-        <w:t xml:space="preserve"/>
-      </w:r>
-    </w:p>
-    <w:p>
-      <w:pPr>
-        <w:jc w:val="center"/>
-        <w:spacing w:before="120"/>
-      </w:pPr>
-      <w:r>
-        <w:rPr>
-          <w:rFonts w:ascii="Arial" w:hAnsi="Arial" w:cs="Arial"/>
-          <w:sz w:val="24"/>
-          <w:sz-cs w:val="24"/>
-        </w:rPr>
-        <w:t xml:space="preserve">2</w:t>
-      </w:r>
-    </w:p>
-    <w:p>
-      <w:pPr>
-        <w:spacing w:before="120"/>
-      </w:pPr>
-      <w:r>
-        <w:rPr>
-          <w:rFonts w:ascii="Arial" w:hAnsi="Arial" w:cs="Arial"/>
-          <w:sz w:val="24"/>
-          <w:sz-cs w:val="24"/>
-        </w:rPr>
-        <w:t xml:space="preserve">Ngoại tệ tự do chuyển đổi (</w:t>
-      </w:r>
-      <w:r>
-        <w:rPr>
-          <w:rFonts w:ascii="Arial" w:hAnsi="Arial" w:cs="Arial"/>
-          <w:sz w:val="24"/>
-          <w:sz-cs w:val="24"/>
-          <w:i/>
-        </w:rPr>
-        <w:t xml:space="preserve">ghi rõ loại ngoại tệ, số tiền được góp bằng mỗi loại ngoại tệ</w:t>
-      </w:r>
-      <w:r>
-        <w:rPr>
-          <w:rFonts w:ascii="Arial" w:hAnsi="Arial" w:cs="Arial"/>
-          <w:sz w:val="24"/>
-          <w:sz-cs w:val="24"/>
-        </w:rPr>
-        <w:t xml:space="preserve">)</w:t>
-      </w:r>
-    </w:p>
-    <w:p>
-      <w:pPr>
-        <w:spacing w:before="120"/>
-      </w:pPr>
-      <w:r>
-        <w:rPr>
-          <w:rFonts w:ascii="Arial" w:hAnsi="Arial" w:cs="Arial"/>
-          <w:sz w:val="24"/>
-          <w:sz-cs w:val="24"/>
-        </w:rPr>
-        <w:t xml:space="preserve"/>
-      </w:r>
-    </w:p>
-    <w:p>
-      <w:pPr>
-        <w:spacing w:before="120"/>
-      </w:pPr>
-      <w:r>
-        <w:rPr>
-          <w:rFonts w:ascii="Arial" w:hAnsi="Arial" w:cs="Arial"/>
-          <w:sz w:val="24"/>
-          <w:sz-cs w:val="24"/>
-        </w:rPr>
-        <w:t xml:space="preserve"/>
-      </w:r>
-    </w:p>
-    <w:p>
-      <w:pPr>
-        <w:jc w:val="center"/>
-        <w:spacing w:before="120"/>
-      </w:pPr>
-      <w:r>
-        <w:rPr>
-          <w:rFonts w:ascii="Arial" w:hAnsi="Arial" w:cs="Arial"/>
-          <w:sz w:val="24"/>
-          <w:sz-cs w:val="24"/>
-        </w:rPr>
-        <w:t xml:space="preserve">3</w:t>
-      </w:r>
-    </w:p>
-    <w:p>
-      <w:pPr>
-        <w:spacing w:before="120"/>
-      </w:pPr>
-      <w:r>
-        <w:rPr>
-          <w:rFonts w:ascii="Arial" w:hAnsi="Arial" w:cs="Arial"/>
-          <w:sz w:val="24"/>
-          <w:sz-cs w:val="24"/>
-        </w:rPr>
-        <w:t xml:space="preserve">Vàng</w:t>
-      </w:r>
-    </w:p>
-    <w:p>
-      <w:pPr>
-        <w:spacing w:before="120"/>
-      </w:pPr>
-      <w:r>
-        <w:rPr>
-          <w:rFonts w:ascii="Arial" w:hAnsi="Arial" w:cs="Arial"/>
-          <w:sz w:val="24"/>
-          <w:sz-cs w:val="24"/>
-        </w:rPr>
-        <w:t xml:space="preserve"/>
-      </w:r>
-    </w:p>
-    <w:p>
-      <w:pPr>
-        <w:spacing w:before="120"/>
-      </w:pPr>
-      <w:r>
-        <w:rPr>
-          <w:rFonts w:ascii="Arial" w:hAnsi="Arial" w:cs="Arial"/>
-          <w:sz w:val="24"/>
-          <w:sz-cs w:val="24"/>
-        </w:rPr>
-        <w:t xml:space="preserve"/>
-      </w:r>
-    </w:p>
-    <w:p>
-      <w:pPr>
-        <w:jc w:val="center"/>
-        <w:spacing w:before="120"/>
-      </w:pPr>
-      <w:r>
-        <w:rPr>
-          <w:rFonts w:ascii="Arial" w:hAnsi="Arial" w:cs="Arial"/>
-          <w:sz w:val="24"/>
-          <w:sz-cs w:val="24"/>
-        </w:rPr>
-        <w:t xml:space="preserve">4</w:t>
-      </w:r>
-    </w:p>
-    <w:p>
-      <w:pPr>
-        <w:spacing w:before="120"/>
-      </w:pPr>
-      <w:r>
-        <w:rPr>
-          <w:rFonts w:ascii="Arial" w:hAnsi="Arial" w:cs="Arial"/>
-          <w:sz w:val="24"/>
-          <w:sz-cs w:val="24"/>
-        </w:rPr>
-        <w:t xml:space="preserve">Quyền sử dụng đất</w:t>
-      </w:r>
-    </w:p>
-    <w:p>
-      <w:pPr>
-        <w:spacing w:before="120"/>
-      </w:pPr>
-      <w:r>
-        <w:rPr>
-          <w:rFonts w:ascii="Arial" w:hAnsi="Arial" w:cs="Arial"/>
-          <w:sz w:val="24"/>
-          <w:sz-cs w:val="24"/>
-        </w:rPr>
-        <w:t xml:space="preserve"/>
-      </w:r>
-    </w:p>
-    <w:p>
-      <w:pPr>
-        <w:spacing w:before="120"/>
-      </w:pPr>
-      <w:r>
-        <w:rPr>
-          <w:rFonts w:ascii="Arial" w:hAnsi="Arial" w:cs="Arial"/>
-          <w:sz w:val="24"/>
-          <w:sz-cs w:val="24"/>
-        </w:rPr>
-        <w:t xml:space="preserve"/>
-      </w:r>
-    </w:p>
-    <w:p>
-      <w:pPr>
-        <w:jc w:val="center"/>
-        <w:spacing w:before="120"/>
-      </w:pPr>
-      <w:r>
-        <w:rPr>
-          <w:rFonts w:ascii="Arial" w:hAnsi="Arial" w:cs="Arial"/>
-          <w:sz w:val="24"/>
-          <w:sz-cs w:val="24"/>
-        </w:rPr>
-        <w:t xml:space="preserve">5</w:t>
-      </w:r>
-    </w:p>
-    <w:p>
-      <w:pPr>
-        <w:spacing w:before="120"/>
-      </w:pPr>
-      <w:r>
-        <w:rPr>
-          <w:rFonts w:ascii="Arial" w:hAnsi="Arial" w:cs="Arial"/>
-          <w:sz w:val="24"/>
-          <w:sz-cs w:val="24"/>
-        </w:rPr>
-        <w:t xml:space="preserve">Quyền sở hữu trí tuệ</w:t>
-      </w:r>
-    </w:p>
-    <w:p>
-      <w:pPr>
-        <w:spacing w:before="120"/>
-      </w:pPr>
-      <w:r>
-        <w:rPr>
-          <w:rFonts w:ascii="Arial" w:hAnsi="Arial" w:cs="Arial"/>
-          <w:sz w:val="24"/>
-          <w:sz-cs w:val="24"/>
-        </w:rPr>
-        <w:t xml:space="preserve"/>
-      </w:r>
-    </w:p>
-    <w:p>
-      <w:pPr>
-        <w:spacing w:before="120"/>
-      </w:pPr>
-      <w:r>
-        <w:rPr>
-          <w:rFonts w:ascii="Arial" w:hAnsi="Arial" w:cs="Arial"/>
-          <w:sz w:val="24"/>
-          <w:sz-cs w:val="24"/>
-        </w:rPr>
-        <w:t xml:space="preserve"/>
-      </w:r>
-    </w:p>
-    <w:p>
-      <w:pPr>
-        <w:jc w:val="center"/>
-        <w:spacing w:before="120"/>
-      </w:pPr>
-      <w:r>
-        <w:rPr>
-          <w:rFonts w:ascii="Arial" w:hAnsi="Arial" w:cs="Arial"/>
-          <w:sz w:val="24"/>
-          <w:sz-cs w:val="24"/>
-        </w:rPr>
-        <w:t xml:space="preserve">6</w:t>
-      </w:r>
-    </w:p>
-    <w:p>
-      <w:pPr>
-        <w:spacing w:before="120"/>
-      </w:pPr>
-      <w:r>
-        <w:rPr>
-          <w:rFonts w:ascii="Arial" w:hAnsi="Arial" w:cs="Arial"/>
-          <w:sz w:val="24"/>
-          <w:sz-cs w:val="24"/>
-        </w:rPr>
-        <w:t xml:space="preserve">Các tài sản khác (</w:t>
-      </w:r>
-      <w:r>
-        <w:rPr>
-          <w:rFonts w:ascii="Arial" w:hAnsi="Arial" w:cs="Arial"/>
-          <w:sz w:val="24"/>
-          <w:sz-cs w:val="24"/>
-          <w:i/>
-        </w:rPr>
-        <w:t xml:space="preserve">ghi rõ loại tài sản, số lượng và giá trị còn lại của mỗi loại tài sản, có thể lập thành danh mục riêng kèm theo hồ sơ đăng ký doanh nghiệp</w:t>
-      </w:r>
-      <w:r>
-        <w:rPr>
-          <w:rFonts w:ascii="Arial" w:hAnsi="Arial" w:cs="Arial"/>
-          <w:sz w:val="24"/>
-          <w:sz-cs w:val="24"/>
-        </w:rPr>
-        <w:t xml:space="preserve">)</w:t>
-      </w:r>
-    </w:p>
-    <w:p>
-      <w:pPr>
-        <w:spacing w:before="120"/>
-      </w:pPr>
-      <w:r>
-        <w:rPr>
-          <w:rFonts w:ascii="Arial" w:hAnsi="Arial" w:cs="Arial"/>
-          <w:sz w:val="24"/>
-          <w:sz-cs w:val="24"/>
-        </w:rPr>
-        <w:t xml:space="preserve"/>
-      </w:r>
-    </w:p>
-    <w:p>
-      <w:pPr>
-        <w:spacing w:before="120"/>
-      </w:pPr>
-      <w:r>
-        <w:rPr>
-          <w:rFonts w:ascii="Arial" w:hAnsi="Arial" w:cs="Arial"/>
-          <w:sz w:val="24"/>
-          <w:sz-cs w:val="24"/>
-        </w:rPr>
-        <w:t xml:space="preserve"/>
-      </w:r>
-    </w:p>
-    <w:p>
-      <w:pPr>
-        <w:jc w:val="center"/>
-        <w:spacing w:before="120"/>
-      </w:pPr>
-      <w:r>
-        <w:rPr>
-          <w:rFonts w:ascii="Arial" w:hAnsi="Arial" w:cs="Arial"/>
-          <w:sz w:val="24"/>
-          <w:sz-cs w:val="24"/>
-        </w:rPr>
-        <w:t xml:space="preserve">Tổng số</w:t>
+    <w:tbl xmlns:ns3="urn:orca:p1b-temp">
+      <w:tblPr>
+        <w:tblW w:type="auto" w:w="0"/>
+        <w:tblLook w:firstColumn="1" w:firstRow="1" w:lastColumn="0" w:lastRow="0" w:noHBand="0" w:noVBand="1" w:val="04A0"/>
+        <w:tblBorders>
+          <w:top w:val="single" w:sz="4" w:color="000000"/>
+          <w:left w:val="single" w:sz="4" w:color="000000"/>
+          <w:bottom w:val="single" w:sz="4" w:color="000000"/>
+          <w:right w:val="single" w:sz="4" w:color="000000"/>
+          <w:insideH w:val="single" w:sz="4" w:color="000000"/>
+          <w:insideV w:val="single" w:sz="4" w:color="000000"/>
+        </w:tblBorders>
+      </w:tblPr>
+      <w:tblGrid>
+        <w:gridCol w:w="2160"/>
+        <w:gridCol w:w="2160"/>
+        <w:gridCol w:w="2160"/>
+        <w:gridCol w:w="2160"/>
+      </w:tblGrid>
+      <w:tr>
+        <w:tc>
+          <w:tcPr>
+            <w:tcW w:type="dxa" w:w="2160"/>
+          </w:tcPr>
+          <w:p>
+            <w:r>
+              <w:rPr>
+                <w:b/>
+              </w:rPr>
+              <w:t>Tài sản góp vốn</w:t>
+            </w:r>
+          </w:p>
+        </w:tc>
+        <w:tc>
+          <w:tcPr>
+            <w:tcW w:type="dxa" w:w="2160"/>
+          </w:tcPr>
+          <w:p>
+            <w:r>
+              <w:rPr>
+                <w:b/>
+              </w:rPr>
+              <w:t>Ghi rõ loại ngoại tệ, số tiền được góp bằng mỗi loại ngoại tệ / loại tài sản, số lượng và giá trị còn lại của mỗi loại tài sản</w:t>
+            </w:r>
+          </w:p>
+        </w:tc>
+        <w:tc>
+          <w:tcPr>
+            <w:tcW w:type="dxa" w:w="2160"/>
+          </w:tcPr>
+          <w:p>
+            <w:r>
+              <w:rPr>
+                <w:b/>
+              </w:rPr>
+              <w:t>Giá trị vốn của từng tài sản trong vốn đầu tư (bằng số, VNĐ)</w:t>
+            </w:r>
+          </w:p>
+        </w:tc>
+        <w:tc>
+          <w:tcPr>
+            <w:tcW w:type="dxa" w:w="2160"/>
+          </w:tcPr>
+          <w:p>
+            <w:r>
+              <w:rPr>
+                <w:b/>
+              </w:rPr>
+              <w:t>Tỷ lệ (%)</w:t>
+            </w:r>
+          </w:p>
+        </w:tc>
+      </w:tr>
+      <w:tr>
+        <w:tc>
+          <w:tcPr>
+            <w:tcW w:type="dxa" w:w="2160"/>
+          </w:tcPr>
+          <w:p>
+            <w:r>
+              <w:rPr>
+                <w:b w:val="0"/>
+              </w:rPr>
+              <w:t>Đồng Việt Nam</w:t>
+            </w:r>
+          </w:p>
+        </w:tc>
+        <w:tc>
+          <w:tcPr>
+            <w:tcW w:type="dxa" w:w="2160"/>
+          </w:tcPr>
+          <w:p>
+            <w:r>
+              <w:rPr>
+                <w:b w:val="0"/>
+              </w:rPr>
+              <w:t>{co_cau_tai_san_gop_von_sau_thay_doi_vdt.dong_viet_nam.chi_tiet_ngoai_te_tai_san_khac}</w:t>
+            </w:r>
+          </w:p>
+        </w:tc>
+        <w:tc>
+          <w:tcPr>
+            <w:tcW w:type="dxa" w:w="2160"/>
+          </w:tcPr>
+          <w:p>
+            <w:r>
+              <w:rPr>
+                <w:b w:val="0"/>
+              </w:rPr>
+              <w:t>{co_cau_tai_san_gop_von_sau_thay_doi_vdt.dong_viet_nam.gia_tri_vnd}</w:t>
+            </w:r>
+          </w:p>
+        </w:tc>
+        <w:tc>
+          <w:tcPr>
+            <w:tcW w:type="dxa" w:w="2160"/>
+          </w:tcPr>
+          <w:p>
+            <w:r>
+              <w:rPr>
+                <w:b w:val="0"/>
+              </w:rPr>
+              <w:t>{co_cau_tai_san_gop_von_sau_thay_doi_vdt.dong_viet_nam.ty_le}</w:t>
+            </w:r>
+          </w:p>
+        </w:tc>
+      </w:tr>
+      <w:tr>
+        <w:tc>
+          <w:tcPr>
+            <w:tcW w:type="dxa" w:w="2160"/>
+          </w:tcPr>
+          <w:p>
+            <w:r>
+              <w:rPr>
+                <w:b w:val="0"/>
+              </w:rPr>
+              <w:t>Ngoại tệ tự do chuyển đổi (ghi rõ loại ngoại tệ, số tiền được góp bằng mỗi loại ngoại tệ)</w:t>
+            </w:r>
+          </w:p>
+        </w:tc>
+        <w:tc>
+          <w:tcPr>
+            <w:tcW w:type="dxa" w:w="2160"/>
+          </w:tcPr>
+          <w:p>
+            <w:r>
+              <w:rPr>
+                <w:b w:val="0"/>
+              </w:rPr>
+              <w:t>{co_cau_tai_san_gop_von_sau_thay_doi_vdt.ngoai_te_tu_do_chuyen_doi.chi_tiet_ngoai_te_tai_san_khac}</w:t>
+            </w:r>
+          </w:p>
+        </w:tc>
+        <w:tc>
+          <w:tcPr>
+            <w:tcW w:type="dxa" w:w="2160"/>
+          </w:tcPr>
+          <w:p>
+            <w:r>
+              <w:rPr>
+                <w:b w:val="0"/>
+              </w:rPr>
+              <w:t>{co_cau_tai_san_gop_von_sau_thay_doi_vdt.ngoai_te_tu_do_chuyen_doi.gia_tri_vnd}</w:t>
+            </w:r>
+          </w:p>
+        </w:tc>
+        <w:tc>
+          <w:tcPr>
+            <w:tcW w:type="dxa" w:w="2160"/>
+          </w:tcPr>
+          <w:p>
+            <w:r>
+              <w:rPr>
+                <w:b w:val="0"/>
+              </w:rPr>
+              <w:t>{co_cau_tai_san_gop_von_sau_thay_doi_vdt.ngoai_te_tu_do_chuyen_doi.ty_le}</w:t>
+            </w:r>
+          </w:p>
+        </w:tc>
+      </w:tr>
+      <w:tr>
+        <w:tc>
+          <w:tcPr>
+            <w:tcW w:type="dxa" w:w="2160"/>
+          </w:tcPr>
+          <w:p>
+            <w:r>
+              <w:rPr>
+                <w:b w:val="0"/>
+              </w:rPr>
+              <w:t>Vàng</w:t>
+            </w:r>
+          </w:p>
+        </w:tc>
+        <w:tc>
+          <w:tcPr>
+            <w:tcW w:type="dxa" w:w="2160"/>
+          </w:tcPr>
+          <w:p>
+            <w:r>
+              <w:rPr>
+                <w:b w:val="0"/>
+              </w:rPr>
+              <w:t>{co_cau_tai_san_gop_von_sau_thay_doi_vdt.vang.chi_tiet_ngoai_te_tai_san_khac}</w:t>
+            </w:r>
+          </w:p>
+        </w:tc>
+        <w:tc>
+          <w:tcPr>
+            <w:tcW w:type="dxa" w:w="2160"/>
+          </w:tcPr>
+          <w:p>
+            <w:r>
+              <w:rPr>
+                <w:b w:val="0"/>
+              </w:rPr>
+              <w:t>{co_cau_tai_san_gop_von_sau_thay_doi_vdt.vang.gia_tri_vnd}</w:t>
+            </w:r>
+          </w:p>
+        </w:tc>
+        <w:tc>
+          <w:tcPr>
+            <w:tcW w:type="dxa" w:w="2160"/>
+          </w:tcPr>
+          <w:p>
+            <w:r>
+              <w:rPr>
+                <w:b w:val="0"/>
+              </w:rPr>
+              <w:t>{co_cau_tai_san_gop_von_sau_thay_doi_vdt.vang.ty_le}</w:t>
+            </w:r>
+          </w:p>
+        </w:tc>
+      </w:tr>
+      <w:tr>
+        <w:tc>
+          <w:tcPr>
+            <w:tcW w:type="dxa" w:w="2160"/>
+          </w:tcPr>
+          <w:p>
+            <w:r>
+              <w:rPr>
+                <w:b w:val="0"/>
+              </w:rPr>
+              <w:t>Quyền sử dụng đất</w:t>
+            </w:r>
+          </w:p>
+        </w:tc>
+        <w:tc>
+          <w:tcPr>
+            <w:tcW w:type="dxa" w:w="2160"/>
+          </w:tcPr>
+          <w:p>
+            <w:r>
+              <w:rPr>
+                <w:b w:val="0"/>
+              </w:rPr>
+              <w:t>{co_cau_tai_san_gop_von_sau_thay_doi_vdt.quyen_su_dung_dat.chi_tiet_ngoai_te_tai_san_khac}</w:t>
+            </w:r>
+          </w:p>
+        </w:tc>
+        <w:tc>
+          <w:tcPr>
+            <w:tcW w:type="dxa" w:w="2160"/>
+          </w:tcPr>
+          <w:p>
+            <w:r>
+              <w:rPr>
+                <w:b w:val="0"/>
+              </w:rPr>
+              <w:t>{co_cau_tai_san_gop_von_sau_thay_doi_vdt.quyen_su_dung_dat.gia_tri_vnd}</w:t>
+            </w:r>
+          </w:p>
+        </w:tc>
+        <w:tc>
+          <w:tcPr>
+            <w:tcW w:type="dxa" w:w="2160"/>
+          </w:tcPr>
+          <w:p>
+            <w:r>
+              <w:rPr>
+                <w:b w:val="0"/>
+              </w:rPr>
+              <w:t>{co_cau_tai_san_gop_von_sau_thay_doi_vdt.quyen_su_dung_dat.ty_le}</w:t>
+            </w:r>
+          </w:p>
+        </w:tc>
+      </w:tr>
+      <w:tr>
+        <w:tc>
+          <w:tcPr>
+            <w:tcW w:type="dxa" w:w="2160"/>
+          </w:tcPr>
+          <w:p>
+            <w:r>
+              <w:rPr>
+                <w:b w:val="0"/>
+              </w:rPr>
+              <w:t>Quyền sở hữu trí tuệ</w:t>
+            </w:r>
+          </w:p>
+        </w:tc>
+        <w:tc>
+          <w:tcPr>
+            <w:tcW w:type="dxa" w:w="2160"/>
+          </w:tcPr>
+          <w:p>
+            <w:r>
+              <w:rPr>
+                <w:b w:val="0"/>
+              </w:rPr>
+              <w:t>{co_cau_tai_san_gop_von_sau_thay_doi_vdt.quyen_so_huu_tri_tue.chi_tiet_ngoai_te_tai_san_khac}</w:t>
+            </w:r>
+          </w:p>
+        </w:tc>
+        <w:tc>
+          <w:tcPr>
+            <w:tcW w:type="dxa" w:w="2160"/>
+          </w:tcPr>
+          <w:p>
+            <w:r>
+              <w:rPr>
+                <w:b w:val="0"/>
+              </w:rPr>
+              <w:t>{co_cau_tai_san_gop_von_sau_thay_doi_vdt.quyen_so_huu_tri_tue.gia_tri_vnd}</w:t>
+            </w:r>
+          </w:p>
+        </w:tc>
+        <w:tc>
+          <w:tcPr>
+            <w:tcW w:type="dxa" w:w="2160"/>
+          </w:tcPr>
+          <w:p>
+            <w:r>
+              <w:rPr>
+                <w:b w:val="0"/>
+              </w:rPr>
+              <w:t>{co_cau_tai_san_gop_von_sau_thay_doi_vdt.quyen_so_huu_tri_tue.ty_le}</w:t>
+            </w:r>
+          </w:p>
+        </w:tc>
+      </w:tr>
+      <w:tr>
+        <w:tc>
+          <w:tcPr>
+            <w:tcW w:type="dxa" w:w="2160"/>
+          </w:tcPr>
+          <w:p>
+            <w:r>
+              <w:rPr>
+                <w:b w:val="0"/>
+              </w:rPr>
+              <w:t>Các tài sản khác (ghi rõ loại tài sản, số lượng và giá trị còn lại của mỗi loại tài sản, có thể lập thành danh mục riêng kèm theo hồ sơ đăng ký đăng ký doanh nghiệp)</w:t>
+            </w:r>
+          </w:p>
+        </w:tc>
+        <w:tc>
+          <w:tcPr>
+            <w:tcW w:type="dxa" w:w="2160"/>
+          </w:tcPr>
+          <w:p>
+            <w:r>
+              <w:rPr>
+                <w:b w:val="0"/>
+              </w:rPr>
+              <w:t>{co_cau_tai_san_gop_von_sau_thay_doi_vdt.tai_san_khac.chi_tiet_ngoai_te_tai_san_khac}</w:t>
+            </w:r>
+          </w:p>
+        </w:tc>
+        <w:tc>
+          <w:tcPr>
+            <w:tcW w:type="dxa" w:w="2160"/>
+          </w:tcPr>
+          <w:p>
+            <w:r>
+              <w:rPr>
+                <w:b w:val="0"/>
+              </w:rPr>
+              <w:t>{co_cau_tai_san_gop_von_sau_thay_doi_vdt.tai_san_khac.gia_tri_vnd}</w:t>
+            </w:r>
+          </w:p>
+        </w:tc>
+        <w:tc>
+          <w:tcPr>
+            <w:tcW w:type="dxa" w:w="2160"/>
+          </w:tcPr>
+          <w:p>
+            <w:r>
+              <w:rPr>
+                <w:b w:val="0"/>
+              </w:rPr>
+              <w:t>{co_cau_tai_san_gop_von_sau_thay_doi_vdt.tai_san_khac.ty_le}</w:t>
+            </w:r>
+          </w:p>
+        </w:tc>
+      </w:tr>
+      <w:tr>
+        <w:tc>
+          <w:tcPr>
+            <w:tcW w:type="dxa" w:w="2160"/>
+          </w:tcPr>
+          <w:p>
+            <w:r>
+              <w:rPr>
+                <w:b w:val="0"/>
+              </w:rPr>
+              <w:t>Tổng số</w:t>
+            </w:r>
+          </w:p>
+        </w:tc>
+        <w:tc>
+          <w:tcPr>
+            <w:tcW w:type="dxa" w:w="2160"/>
+          </w:tcPr>
+          <w:p>
+            <w:r>
+              <w:rPr>
+                <w:b w:val="0"/>
+              </w:rPr>
+              <w:t>{co_cau_tai_san_gop_von_sau_thay_doi_vdt.tong_so.chi_tiet_ngoai_te_tai_san_khac}</w:t>
+            </w:r>
+          </w:p>
+        </w:tc>
+        <w:tc>
+          <w:tcPr>
+            <w:tcW w:type="dxa" w:w="2160"/>
+          </w:tcPr>
+          <w:p>
+            <w:r>
+              <w:rPr>
+                <w:b w:val="0"/>
+              </w:rPr>
+              <w:t>{co_cau_tai_san_gop_von_sau_thay_doi_vdt.tong_so.gia_tri_vnd}</w:t>
+            </w:r>
+          </w:p>
+        </w:tc>
+        <w:tc>
+          <w:tcPr>
+            <w:tcW w:type="dxa" w:w="2160"/>
+          </w:tcPr>
+          <w:p>
+            <w:r>
+              <w:rPr>
+                <w:b w:val="0"/>
+              </w:rPr>
+              <w:t>{co_cau_tai_san_gop_von_sau_thay_doi_vdt.tong_so.ty_le}</w:t>
+            </w:r>
+          </w:p>
+        </w:tc>
+      </w:tr>
+    </w:tbl>
+    <w:p/>
+    <w:p>
+      <w:pPr>
+        <w:spacing w:before="120"/>
+      </w:pPr>
+      <w:r>
+        <w:rPr>
+          <w:rFonts w:ascii="Arial" w:hAnsi="Arial" w:cs="Arial"/>
+          <w:sz w:val="24"/>
+          <w:sz-cs w:val="24"/>
+        </w:rPr>
+        <w:t xml:space="preserve"/>
+      </w:r>
+    </w:p>
+    <w:p>
+      <w:pPr>
+        <w:spacing w:before="120"/>
+      </w:pPr>
+      <w:r>
+        <w:rPr>
+          <w:rFonts w:ascii="Arial" w:hAnsi="Arial" w:cs="Arial"/>
+          <w:sz w:val="24"/>
+          <w:sz-cs w:val="24"/>
+        </w:rPr>
+        <w:t xml:space="preserve"/>
+      </w:r>
+    </w:p>
+    <w:p>
+      <w:pPr>
+        <w:spacing w:before="120"/>
+      </w:pPr>
+      <w:r>
+        <w:rPr>
+          <w:rFonts w:ascii="Arial" w:hAnsi="Arial" w:cs="Arial"/>
+          <w:sz w:val="24"/>
+          <w:sz-cs w:val="24"/>
+        </w:rPr>
+        <w:t xml:space="preserve"/>
+      </w:r>
+    </w:p>
+    <w:p>
+      <w:pPr>
+        <w:spacing w:before="120"/>
+      </w:pPr>
+      <w:r>
+        <w:rPr>
+          <w:rFonts w:ascii="Arial" w:hAnsi="Arial" w:cs="Arial"/>
+          <w:sz w:val="24"/>
+          <w:sz-cs w:val="24"/>
+        </w:rPr>
+        <w:t xml:space="preserve"/>
+      </w:r>
+    </w:p>
+    <w:p>
+      <w:pPr>
+        <w:spacing w:before="120"/>
+      </w:pPr>
+      <w:r>
+        <w:rPr>
+          <w:rFonts w:ascii="Arial" w:hAnsi="Arial" w:cs="Arial"/>
+          <w:sz w:val="24"/>
+          <w:sz-cs w:val="24"/>
+        </w:rPr>
+        <w:t xml:space="preserve"/>
+      </w:r>
+    </w:p>
+    <w:p>
+      <w:pPr>
+        <w:spacing w:before="120"/>
+      </w:pPr>
+      <w:r>
+        <w:rPr>
+          <w:rFonts w:ascii="Arial" w:hAnsi="Arial" w:cs="Arial"/>
+          <w:sz w:val="24"/>
+          <w:sz-cs w:val="24"/>
+        </w:rPr>
+        <w:t xml:space="preserve"/>
+      </w:r>
+    </w:p>
+    <w:p>
+      <w:pPr>
+        <w:spacing w:before="120"/>
+      </w:pPr>
+      <w:r>
+        <w:rPr>
+          <w:rFonts w:ascii="Arial" w:hAnsi="Arial" w:cs="Arial"/>
+          <w:sz w:val="24"/>
+          <w:sz-cs w:val="24"/>
+        </w:rPr>
+        <w:t xml:space="preserve"/>
+      </w:r>
+    </w:p>
+    <w:p>
+      <w:pPr>
+        <w:spacing w:before="120"/>
+      </w:pPr>
+      <w:r>
+        <w:rPr>
+          <w:rFonts w:ascii="Arial" w:hAnsi="Arial" w:cs="Arial"/>
+          <w:sz w:val="24"/>
+          <w:sz-cs w:val="24"/>
+        </w:rPr>
+        <w:t xml:space="preserve"/>
+      </w:r>
+    </w:p>
+    <w:p>
+      <w:pPr>
+        <w:spacing w:before="120"/>
+      </w:pPr>
+      <w:r>
+        <w:rPr>
+          <w:rFonts w:ascii="Arial" w:hAnsi="Arial" w:cs="Arial"/>
+          <w:sz w:val="24"/>
+          <w:sz-cs w:val="24"/>
+        </w:rPr>
+        <w:t xml:space="preserve"/>
+      </w:r>
+    </w:p>
+    <w:p>
+      <w:pPr>
+        <w:spacing w:before="120"/>
+      </w:pPr>
+      <w:r>
+        <w:rPr>
+          <w:rFonts w:ascii="Arial" w:hAnsi="Arial" w:cs="Arial"/>
+          <w:sz w:val="24"/>
+          <w:sz-cs w:val="24"/>
+        </w:rPr>
+        <w:t xml:space="preserve"/>
+      </w:r>
+    </w:p>
+    <w:p>
+      <w:pPr>
+        <w:spacing w:before="120"/>
+      </w:pPr>
+      <w:r>
+        <w:rPr>
+          <w:rFonts w:ascii="Arial" w:hAnsi="Arial" w:cs="Arial"/>
+          <w:sz w:val="24"/>
+          <w:sz-cs w:val="24"/>
+        </w:rPr>
+        <w:t xml:space="preserve"/>
+      </w:r>
+    </w:p>
+    <w:p>
+      <w:pPr>
+        <w:spacing w:before="120"/>
+      </w:pPr>
+      <w:r>
+        <w:rPr>
+          <w:rFonts w:ascii="Arial" w:hAnsi="Arial" w:cs="Arial"/>
+          <w:sz w:val="24"/>
+          <w:sz-cs w:val="24"/>
+        </w:rPr>
+        <w:t xml:space="preserve"/>
       </w:r>
     </w:p>
     <w:p>

</xml_diff>